<commit_message>
update manuscript copyedited tables
</commit_message>
<xml_diff>
--- a/manuscript_copyedited.docx
+++ b/manuscript_copyedited.docx
@@ -11991,7 +11991,7 @@
                     <w:jc w:val="center"/>
                   </w:pPr>
                   <w:r>
-                    <w:t xml:space="preserve">Structural fixed effect</w:t>
+                    <w:t xml:space="preserve">Fixed effect</w:t>
                   </w:r>
                 </w:p>
               </w:tc>
@@ -12070,7 +12070,7 @@
                     <w:jc w:val="center"/>
                   </w:pPr>
                   <w:r>
-                    <w:t xml:space="preserve">Structural fixed effect</w:t>
+                    <w:t xml:space="preserve">Fixed effect</w:t>
                   </w:r>
                 </w:p>
               </w:tc>
@@ -12146,7 +12146,7 @@
                     <w:jc w:val="center"/>
                   </w:pPr>
                   <w:r>
-                    <w:t xml:space="preserve">Structural fixed effect</w:t>
+                    <w:t xml:space="preserve">Fixed effect</w:t>
                   </w:r>
                 </w:p>
               </w:tc>
@@ -12231,7 +12231,7 @@
                     <w:jc w:val="center"/>
                   </w:pPr>
                   <w:r>
-                    <w:t xml:space="preserve">Residual variability</w:t>
+                    <w:t xml:space="preserve">RUV</w:t>
                   </w:r>
                 </w:p>
               </w:tc>
@@ -12307,7 +12307,7 @@
                     <w:jc w:val="center"/>
                   </w:pPr>
                   <w:r>
-                    <w:t xml:space="preserve">BSV SD</w:t>
+                    <w:t xml:space="preserve">BSV</w:t>
                   </w:r>
                 </w:p>
               </w:tc>
@@ -12395,7 +12395,7 @@
                     <w:jc w:val="center"/>
                   </w:pPr>
                   <w:r>
-                    <w:t xml:space="preserve">BSV SD</w:t>
+                    <w:t xml:space="preserve">BSV</w:t>
                   </w:r>
                 </w:p>
               </w:tc>
@@ -12480,7 +12480,7 @@
                     <w:jc w:val="center"/>
                   </w:pPr>
                   <w:r>
-                    <w:t xml:space="preserve">BSV SD</w:t>
+                    <w:t xml:space="preserve">BSV</w:t>
                   </w:r>
                 </w:p>
               </w:tc>
@@ -12574,7 +12574,7 @@
                     <w:jc w:val="center"/>
                   </w:pPr>
                   <w:r>
-                    <w:t xml:space="preserve">Structural fixed effect</w:t>
+                    <w:t xml:space="preserve">Fixed effect</w:t>
                   </w:r>
                 </w:p>
               </w:tc>
@@ -12653,7 +12653,7 @@
                     <w:jc w:val="center"/>
                   </w:pPr>
                   <w:r>
-                    <w:t xml:space="preserve">Structural fixed effect</w:t>
+                    <w:t xml:space="preserve">Fixed effect</w:t>
                   </w:r>
                 </w:p>
               </w:tc>
@@ -12729,7 +12729,7 @@
                     <w:jc w:val="center"/>
                   </w:pPr>
                   <w:r>
-                    <w:t xml:space="preserve">Structural fixed effect</w:t>
+                    <w:t xml:space="preserve">Fixed effect</w:t>
                   </w:r>
                 </w:p>
               </w:tc>
@@ -12814,7 +12814,7 @@
                     <w:jc w:val="center"/>
                   </w:pPr>
                   <w:r>
-                    <w:t xml:space="preserve">Residual variability</w:t>
+                    <w:t xml:space="preserve">RUV</w:t>
                   </w:r>
                 </w:p>
               </w:tc>
@@ -12890,7 +12890,7 @@
                     <w:jc w:val="center"/>
                   </w:pPr>
                   <w:r>
-                    <w:t xml:space="preserve">BSV SD</w:t>
+                    <w:t xml:space="preserve">BSV</w:t>
                   </w:r>
                 </w:p>
               </w:tc>
@@ -12978,7 +12978,7 @@
                     <w:jc w:val="center"/>
                   </w:pPr>
                   <w:r>
-                    <w:t xml:space="preserve">BSV SD</w:t>
+                    <w:t xml:space="preserve">BSV</w:t>
                   </w:r>
                 </w:p>
               </w:tc>
@@ -13063,7 +13063,7 @@
                     <w:jc w:val="center"/>
                   </w:pPr>
                   <w:r>
-                    <w:t xml:space="preserve">BSV SD</w:t>
+                    <w:t xml:space="preserve">BSV</w:t>
                   </w:r>
                 </w:p>
               </w:tc>
@@ -13147,18 +13147,15 @@
               <w:pStyle w:val="ImageCaption"/>
             </w:pPr>
             <w:r>
-              <w:t xml:space="preserve">Table S1: Mean relative bias (%) in structural fixed effects, residual variability, and random-effect standard deviations by posterior architecture and</w:t>
-            </w:r>
-            <w:r>
-              <w:t xml:space="preserve"> </w:t>
+              <w:t xml:space="preserve">Table S1: Values are mean relative bias (%) with the standard deviation across replicates in parentheses. BSV, between-subject variability; RUV, residual unexplained variability. BSV parameters (</w:t>
             </w:r>
             <m:oMath>
               <m:r>
-                <m:t>K</m:t>
+                <m:t>ω</m:t>
               </m:r>
             </m:oMath>
             <w:r>
-              <w:t xml:space="preserve">. Values in parentheses are the standard deviation of relative bias across replicates.</w:t>
+              <w:t xml:space="preserve">) are reported as standard deviations.</w:t>
             </w:r>
           </w:p>
           <w:bookmarkEnd w:id="97"/>
@@ -13358,7 +13355,7 @@
                     <w:jc w:val="center"/>
                   </w:pPr>
                   <w:r>
-                    <w:t xml:space="preserve">Structural fixed effect</w:t>
+                    <w:t xml:space="preserve">Fixed effect</w:t>
                   </w:r>
                 </w:p>
               </w:tc>
@@ -13449,7 +13446,7 @@
                     <w:jc w:val="center"/>
                   </w:pPr>
                   <w:r>
-                    <w:t xml:space="preserve">Structural fixed effect</w:t>
+                    <w:t xml:space="preserve">Fixed effect</w:t>
                   </w:r>
                 </w:p>
               </w:tc>
@@ -13537,7 +13534,7 @@
                     <w:jc w:val="center"/>
                   </w:pPr>
                   <w:r>
-                    <w:t xml:space="preserve">Structural fixed effect</w:t>
+                    <w:t xml:space="preserve">Fixed effect</w:t>
                   </w:r>
                 </w:p>
               </w:tc>
@@ -13634,7 +13631,7 @@
                     <w:jc w:val="center"/>
                   </w:pPr>
                   <w:r>
-                    <w:t xml:space="preserve">Residual variability</w:t>
+                    <w:t xml:space="preserve">RUV</w:t>
                   </w:r>
                 </w:p>
               </w:tc>
@@ -13722,7 +13719,7 @@
                     <w:jc w:val="center"/>
                   </w:pPr>
                   <w:r>
-                    <w:t xml:space="preserve">BSV SD</w:t>
+                    <w:t xml:space="preserve">BSV</w:t>
                   </w:r>
                 </w:p>
               </w:tc>
@@ -13822,7 +13819,7 @@
                     <w:jc w:val="center"/>
                   </w:pPr>
                   <w:r>
-                    <w:t xml:space="preserve">BSV SD</w:t>
+                    <w:t xml:space="preserve">BSV</w:t>
                   </w:r>
                 </w:p>
               </w:tc>
@@ -13919,7 +13916,7 @@
                     <w:jc w:val="center"/>
                   </w:pPr>
                   <w:r>
-                    <w:t xml:space="preserve">BSV SD</w:t>
+                    <w:t xml:space="preserve">BSV</w:t>
                   </w:r>
                 </w:p>
               </w:tc>
@@ -14025,7 +14022,7 @@
                     <w:jc w:val="center"/>
                   </w:pPr>
                   <w:r>
-                    <w:t xml:space="preserve">Structural fixed effect</w:t>
+                    <w:t xml:space="preserve">Fixed effect</w:t>
                   </w:r>
                 </w:p>
               </w:tc>
@@ -14116,7 +14113,7 @@
                     <w:jc w:val="center"/>
                   </w:pPr>
                   <w:r>
-                    <w:t xml:space="preserve">Structural fixed effect</w:t>
+                    <w:t xml:space="preserve">Fixed effect</w:t>
                   </w:r>
                 </w:p>
               </w:tc>
@@ -14204,7 +14201,7 @@
                     <w:jc w:val="center"/>
                   </w:pPr>
                   <w:r>
-                    <w:t xml:space="preserve">Structural fixed effect</w:t>
+                    <w:t xml:space="preserve">Fixed effect</w:t>
                   </w:r>
                 </w:p>
               </w:tc>
@@ -14301,7 +14298,7 @@
                     <w:jc w:val="center"/>
                   </w:pPr>
                   <w:r>
-                    <w:t xml:space="preserve">Residual variability</w:t>
+                    <w:t xml:space="preserve">RUV</w:t>
                   </w:r>
                 </w:p>
               </w:tc>
@@ -14389,7 +14386,7 @@
                     <w:jc w:val="center"/>
                   </w:pPr>
                   <w:r>
-                    <w:t xml:space="preserve">BSV SD</w:t>
+                    <w:t xml:space="preserve">BSV</w:t>
                   </w:r>
                 </w:p>
               </w:tc>
@@ -14489,7 +14486,7 @@
                     <w:jc w:val="center"/>
                   </w:pPr>
                   <w:r>
-                    <w:t xml:space="preserve">BSV SD</w:t>
+                    <w:t xml:space="preserve">BSV</w:t>
                   </w:r>
                 </w:p>
               </w:tc>
@@ -14586,7 +14583,7 @@
                     <w:jc w:val="center"/>
                   </w:pPr>
                   <w:r>
-                    <w:t xml:space="preserve">BSV SD</w:t>
+                    <w:t xml:space="preserve">BSV</w:t>
                   </w:r>
                 </w:p>
               </w:tc>
@@ -14692,7 +14689,7 @@
                     <w:jc w:val="center"/>
                   </w:pPr>
                   <w:r>
-                    <w:t xml:space="preserve">Structural fixed effect</w:t>
+                    <w:t xml:space="preserve">Fixed effect</w:t>
                   </w:r>
                 </w:p>
               </w:tc>
@@ -14783,7 +14780,7 @@
                     <w:jc w:val="center"/>
                   </w:pPr>
                   <w:r>
-                    <w:t xml:space="preserve">Structural fixed effect</w:t>
+                    <w:t xml:space="preserve">Fixed effect</w:t>
                   </w:r>
                 </w:p>
               </w:tc>
@@ -14871,7 +14868,7 @@
                     <w:jc w:val="center"/>
                   </w:pPr>
                   <w:r>
-                    <w:t xml:space="preserve">Structural fixed effect</w:t>
+                    <w:t xml:space="preserve">Fixed effect</w:t>
                   </w:r>
                 </w:p>
               </w:tc>
@@ -14968,7 +14965,7 @@
                     <w:jc w:val="center"/>
                   </w:pPr>
                   <w:r>
-                    <w:t xml:space="preserve">Residual variability</w:t>
+                    <w:t xml:space="preserve">RUV</w:t>
                   </w:r>
                 </w:p>
               </w:tc>
@@ -15056,7 +15053,7 @@
                     <w:jc w:val="center"/>
                   </w:pPr>
                   <w:r>
-                    <w:t xml:space="preserve">BSV SD</w:t>
+                    <w:t xml:space="preserve">BSV</w:t>
                   </w:r>
                 </w:p>
               </w:tc>
@@ -15156,7 +15153,7 @@
                     <w:jc w:val="center"/>
                   </w:pPr>
                   <w:r>
-                    <w:t xml:space="preserve">BSV SD</w:t>
+                    <w:t xml:space="preserve">BSV</w:t>
                   </w:r>
                 </w:p>
               </w:tc>
@@ -15253,7 +15250,7 @@
                     <w:jc w:val="center"/>
                   </w:pPr>
                   <w:r>
-                    <w:t xml:space="preserve">BSV SD</w:t>
+                    <w:t xml:space="preserve">BSV</w:t>
                   </w:r>
                 </w:p>
               </w:tc>
@@ -15337,18 +15334,15 @@
               <w:pStyle w:val="ImageCaption"/>
             </w:pPr>
             <w:r>
-              <w:t xml:space="preserve">Table S2: Mean relative bias (%) in structural fixed effects, residual variability, and random-effect standard deviations for the dense Phase 1 sampling design, by posterior architecture, variational family, and</w:t>
-            </w:r>
-            <w:r>
-              <w:t xml:space="preserve"> </w:t>
+              <w:t xml:space="preserve">Table S2: Values are mean relative bias (%) with the standard deviation across replicates in parentheses. BSV, between-subject variability; RUV, residual unexplained variability. BSV parameters (</w:t>
             </w:r>
             <m:oMath>
               <m:r>
-                <m:t>K</m:t>
+                <m:t>ω</m:t>
               </m:r>
             </m:oMath>
             <w:r>
-              <w:t xml:space="preserve">. Values are mean relative bias with the standard deviation across replicates in parentheses.</w:t>
+              <w:t xml:space="preserve">) are reported as standard deviations.</w:t>
             </w:r>
           </w:p>
           <w:bookmarkEnd w:id="98"/>
@@ -15548,7 +15542,7 @@
                     <w:jc w:val="center"/>
                   </w:pPr>
                   <w:r>
-                    <w:t xml:space="preserve">Structural fixed effect</w:t>
+                    <w:t xml:space="preserve">Fixed effect</w:t>
                   </w:r>
                 </w:p>
               </w:tc>
@@ -15639,7 +15633,7 @@
                     <w:jc w:val="center"/>
                   </w:pPr>
                   <w:r>
-                    <w:t xml:space="preserve">Structural fixed effect</w:t>
+                    <w:t xml:space="preserve">Fixed effect</w:t>
                   </w:r>
                 </w:p>
               </w:tc>
@@ -15727,7 +15721,7 @@
                     <w:jc w:val="center"/>
                   </w:pPr>
                   <w:r>
-                    <w:t xml:space="preserve">Structural fixed effect</w:t>
+                    <w:t xml:space="preserve">Fixed effect</w:t>
                   </w:r>
                 </w:p>
               </w:tc>
@@ -15824,7 +15818,7 @@
                     <w:jc w:val="center"/>
                   </w:pPr>
                   <w:r>
-                    <w:t xml:space="preserve">Residual variability</w:t>
+                    <w:t xml:space="preserve">RUV</w:t>
                   </w:r>
                 </w:p>
               </w:tc>
@@ -15912,7 +15906,7 @@
                     <w:jc w:val="center"/>
                   </w:pPr>
                   <w:r>
-                    <w:t xml:space="preserve">BSV SD</w:t>
+                    <w:t xml:space="preserve">BSV</w:t>
                   </w:r>
                 </w:p>
               </w:tc>
@@ -16012,7 +16006,7 @@
                     <w:jc w:val="center"/>
                   </w:pPr>
                   <w:r>
-                    <w:t xml:space="preserve">BSV SD</w:t>
+                    <w:t xml:space="preserve">BSV</w:t>
                   </w:r>
                 </w:p>
               </w:tc>
@@ -16109,7 +16103,7 @@
                     <w:jc w:val="center"/>
                   </w:pPr>
                   <w:r>
-                    <w:t xml:space="preserve">BSV SD</w:t>
+                    <w:t xml:space="preserve">BSV</w:t>
                   </w:r>
                 </w:p>
               </w:tc>
@@ -16215,7 +16209,7 @@
                     <w:jc w:val="center"/>
                   </w:pPr>
                   <w:r>
-                    <w:t xml:space="preserve">Structural fixed effect</w:t>
+                    <w:t xml:space="preserve">Fixed effect</w:t>
                   </w:r>
                 </w:p>
               </w:tc>
@@ -16306,7 +16300,7 @@
                     <w:jc w:val="center"/>
                   </w:pPr>
                   <w:r>
-                    <w:t xml:space="preserve">Structural fixed effect</w:t>
+                    <w:t xml:space="preserve">Fixed effect</w:t>
                   </w:r>
                 </w:p>
               </w:tc>
@@ -16394,7 +16388,7 @@
                     <w:jc w:val="center"/>
                   </w:pPr>
                   <w:r>
-                    <w:t xml:space="preserve">Structural fixed effect</w:t>
+                    <w:t xml:space="preserve">Fixed effect</w:t>
                   </w:r>
                 </w:p>
               </w:tc>
@@ -16491,7 +16485,7 @@
                     <w:jc w:val="center"/>
                   </w:pPr>
                   <w:r>
-                    <w:t xml:space="preserve">Residual variability</w:t>
+                    <w:t xml:space="preserve">RUV</w:t>
                   </w:r>
                 </w:p>
               </w:tc>
@@ -16579,7 +16573,7 @@
                     <w:jc w:val="center"/>
                   </w:pPr>
                   <w:r>
-                    <w:t xml:space="preserve">BSV SD</w:t>
+                    <w:t xml:space="preserve">BSV</w:t>
                   </w:r>
                 </w:p>
               </w:tc>
@@ -16679,7 +16673,7 @@
                     <w:jc w:val="center"/>
                   </w:pPr>
                   <w:r>
-                    <w:t xml:space="preserve">BSV SD</w:t>
+                    <w:t xml:space="preserve">BSV</w:t>
                   </w:r>
                 </w:p>
               </w:tc>
@@ -16776,7 +16770,7 @@
                     <w:jc w:val="center"/>
                   </w:pPr>
                   <w:r>
-                    <w:t xml:space="preserve">BSV SD</w:t>
+                    <w:t xml:space="preserve">BSV</w:t>
                   </w:r>
                 </w:p>
               </w:tc>
@@ -16882,7 +16876,7 @@
                     <w:jc w:val="center"/>
                   </w:pPr>
                   <w:r>
-                    <w:t xml:space="preserve">Structural fixed effect</w:t>
+                    <w:t xml:space="preserve">Fixed effect</w:t>
                   </w:r>
                 </w:p>
               </w:tc>
@@ -16973,7 +16967,7 @@
                     <w:jc w:val="center"/>
                   </w:pPr>
                   <w:r>
-                    <w:t xml:space="preserve">Structural fixed effect</w:t>
+                    <w:t xml:space="preserve">Fixed effect</w:t>
                   </w:r>
                 </w:p>
               </w:tc>
@@ -17061,7 +17055,7 @@
                     <w:jc w:val="center"/>
                   </w:pPr>
                   <w:r>
-                    <w:t xml:space="preserve">Structural fixed effect</w:t>
+                    <w:t xml:space="preserve">Fixed effect</w:t>
                   </w:r>
                 </w:p>
               </w:tc>
@@ -17158,7 +17152,7 @@
                     <w:jc w:val="center"/>
                   </w:pPr>
                   <w:r>
-                    <w:t xml:space="preserve">Residual variability</w:t>
+                    <w:t xml:space="preserve">RUV</w:t>
                   </w:r>
                 </w:p>
               </w:tc>
@@ -17246,7 +17240,7 @@
                     <w:jc w:val="center"/>
                   </w:pPr>
                   <w:r>
-                    <w:t xml:space="preserve">BSV SD</w:t>
+                    <w:t xml:space="preserve">BSV</w:t>
                   </w:r>
                 </w:p>
               </w:tc>
@@ -17346,7 +17340,7 @@
                     <w:jc w:val="center"/>
                   </w:pPr>
                   <w:r>
-                    <w:t xml:space="preserve">BSV SD</w:t>
+                    <w:t xml:space="preserve">BSV</w:t>
                   </w:r>
                 </w:p>
               </w:tc>
@@ -17443,7 +17437,7 @@
                     <w:jc w:val="center"/>
                   </w:pPr>
                   <w:r>
-                    <w:t xml:space="preserve">BSV SD</w:t>
+                    <w:t xml:space="preserve">BSV</w:t>
                   </w:r>
                 </w:p>
               </w:tc>
@@ -17527,18 +17521,15 @@
               <w:pStyle w:val="ImageCaption"/>
             </w:pPr>
             <w:r>
-              <w:t xml:space="preserve">Table S3: Mean relative bias (%) in structural fixed effects, residual variability, and random-effect standard deviations for the sparse Phase 1 sampling design, by posterior architecture, variational family, and</w:t>
-            </w:r>
-            <w:r>
-              <w:t xml:space="preserve"> </w:t>
+              <w:t xml:space="preserve">Table S3: Values are mean relative bias (%) with the standard deviation across replicates in parentheses. BSV, between-subject variability; RUV, residual unexplained variability. BSV parameters (</w:t>
             </w:r>
             <m:oMath>
               <m:r>
-                <m:t>K</m:t>
+                <m:t>ω</m:t>
               </m:r>
             </m:oMath>
             <w:r>
-              <w:t xml:space="preserve">. Values are mean relative bias with the standard deviation across replicates in parentheses.</w:t>
+              <w:t xml:space="preserve">) are reported as standard deviations.</w:t>
             </w:r>
           </w:p>
           <w:bookmarkEnd w:id="99"/>

</xml_diff>

<commit_message>
update manuscript copyedited for the nonlinear + amortized + gaussian instability
</commit_message>
<xml_diff>
--- a/manuscript_copyedited.docx
+++ b/manuscript_copyedited.docx
@@ -179,7 +179,7 @@
           <w:i/>
           <w:iCs/>
         </w:rPr>
-        <w:t xml:space="preserve">amortized*</w:t>
+        <w:t xml:space="preserve">amortized</w:t>
       </w:r>
       <w:r>
         <w:t xml:space="preserve"> </w:t>
@@ -1264,7 +1264,7 @@
           <w:i/>
           <w:iCs/>
         </w:rPr>
-        <w:t xml:space="preserve">between-subject variability*</w:t>
+        <w:t xml:space="preserve">between-subject variability</w:t>
       </w:r>
       <w:r>
         <w:t xml:space="preserve"> </w:t>
@@ -3053,7 +3053,7 @@
           <w:i/>
           <w:iCs/>
         </w:rPr>
-        <w:t xml:space="preserve">free*</w:t>
+        <w:t xml:space="preserve">free</w:t>
       </w:r>
       <w:r>
         <w:t xml:space="preserve"> </w:t>
@@ -3161,7 +3161,7 @@
           <w:i/>
           <w:iCs/>
         </w:rPr>
-        <w:t xml:space="preserve">amortized*</w:t>
+        <w:t xml:space="preserve">amortized</w:t>
       </w:r>
       <w:r>
         <w:t xml:space="preserve"> </w:t>
@@ -7700,13 +7700,13 @@
         <w:t xml:space="preserve"> </w:t>
       </w:r>
       <w:r>
-        <w:t xml:space="preserve">from the table and figure above and discussed further, with a working</w:t>
-      </w:r>
-      <w:r>
-        <w:t xml:space="preserve"> </w:t>
-      </w:r>
-      <w:r>
-        <w:t xml:space="preserve">hypothesis, in the Discussion below.</w:t>
+        <w:t xml:space="preserve">from the table and figure above and discussed further, with candidate</w:t>
+      </w:r>
+      <w:r>
+        <w:t xml:space="preserve"> </w:t>
+      </w:r>
+      <w:r>
+        <w:t xml:space="preserve">explanations, in the Discussion below.</w:t>
       </w:r>
     </w:p>
     <w:bookmarkEnd w:id="56"/>
@@ -10671,7 +10671,64 @@
         <w:pStyle w:val="BodyText"/>
       </w:pPr>
       <w:r>
-        <w:t xml:space="preserve">A distinct instability was observed when the amortized Gaussian posterior was applied to the nonlinear Michaelis-Menten model. Because no flow was involved, this behavior cannot be explained by the same base-distribution coupling. One possibility is that a single shared encoder is more difficult to train when subject trajectories span qualitatively different dynamical regimes, including saturated, transitional, and approximately first-order elimination. This interpretation remains speculative and requires dedicated investigation.</w:t>
+        <w:t xml:space="preserve">A distinct instability was observed when the amortized Gaussian posterior was applied to the nonlinear Michaelis-Menten model. Because no flow was involved, this behavior cannot be explained by the same base-distribution coupling. A diagnostic feature of this failure is that it worsens, rather than improves, with increasing</w:t>
+      </w:r>
+      <w:r>
+        <w:t xml:space="preserve"> </w:t>
+      </w:r>
+      <m:oMath>
+        <m:r>
+          <m:t>K</m:t>
+        </m:r>
+      </m:oMath>
+      <w:r>
+        <w:t xml:space="preserve">, the opposite of the pattern observed everywhere else in this work. This directionality is consistent with a known pathology of importance-weighted training objectives: increasing</w:t>
+      </w:r>
+      <w:r>
+        <w:t xml:space="preserve"> </w:t>
+      </w:r>
+      <m:oMath>
+        <m:r>
+          <m:t>K</m:t>
+        </m:r>
+      </m:oMath>
+      <w:r>
+        <w:t xml:space="preserve"> </w:t>
+      </w:r>
+      <w:r>
+        <w:t xml:space="preserve">improves the gradient signal-to-noise ratio for global model parameters but degrades it specifically for inference-network parameters</w:t>
+      </w:r>
+      <w:r>
+        <w:t xml:space="preserve"> </w:t>
+      </w:r>
+      <w:r>
+        <w:t xml:space="preserve">(Rainforth et al. 2018)</w:t>
+      </w:r>
+      <w:r>
+        <w:t xml:space="preserve">, a problem the doubly-reparameterized gradient estimator was designed to address but which was not used in the amortized fits reported here. This may compound with a harder representation problem, since a single shared encoder must map subject trajectories spanning saturated, transitional, and approximately first-order elimination regimes onto variational parameters, a substantially more complex mapping than in the linear tier, and consistent with known limits on when amortized inference can match a per-subject (free) solution</w:t>
+      </w:r>
+      <w:r>
+        <w:t xml:space="preserve"> </w:t>
+      </w:r>
+      <w:r>
+        <w:t xml:space="preserve">(Margossian and Blei 2024)</w:t>
+      </w:r>
+      <w:r>
+        <w:t xml:space="preserve">. Both explanations remain unconfirmed; distinguishing an encoder-optimization failure from a representation-capacity limitation, for example via encoder gradient diagnostics across</w:t>
+      </w:r>
+      <w:r>
+        <w:t xml:space="preserve"> </w:t>
+      </w:r>
+      <m:oMath>
+        <m:r>
+          <m:t>K</m:t>
+        </m:r>
+      </m:oMath>
+      <w:r>
+        <w:t xml:space="preserve"> </w:t>
+      </w:r>
+      <w:r>
+        <w:t xml:space="preserve">or a semi-amortized warm-start, is noted as future work below.</w:t>
       </w:r>
     </w:p>
     <w:p>
@@ -10983,7 +11040,18 @@
         <w:pStyle w:val="BodyText"/>
       </w:pPr>
       <w:r>
-        <w:t xml:space="preserve">Future work should therefore focus on production-scale evaluation of the decoupled amortized-flow architecture, direct FOCEI/SAEM benchmarking on nonlinear models, explicit control of computational parallelism in runtime comparisons, and extension to more complex NLME structures. Because numerical integration dominated the cost of the nonlinear experiments, evaluating differentiable, purpose-built ODE solvers such as</w:t>
+        <w:t xml:space="preserve">Future work should therefore focus on production-scale evaluation of the decoupled amortized-flow architecture, diagnostic investigation of the amortized-Gaussian nonlinear instability (encoder gradient variance across</w:t>
+      </w:r>
+      <w:r>
+        <w:t xml:space="preserve"> </w:t>
+      </w:r>
+      <m:oMath>
+        <m:r>
+          <m:t>K</m:t>
+        </m:r>
+      </m:oMath>
+      <w:r>
+        <w:t xml:space="preserve">, encoder capacity, and semi-amortized initialization), direct FOCEI/SAEM benchmarking on nonlinear models, explicit control of computational parallelism in runtime comparisons, and extension to more complex NLME structures. Because numerical integration dominated the cost of the nonlinear experiments, evaluating differentiable, purpose-built ODE solvers such as</w:t>
       </w:r>
       <w:r>
         <w:t xml:space="preserve"> </w:t>
@@ -11018,7 +11086,7 @@
     </w:p>
     <w:bookmarkEnd w:id="75"/>
     <w:bookmarkEnd w:id="76"/>
-    <w:bookmarkStart w:id="96" w:name="references"/>
+    <w:bookmarkStart w:id="98" w:name="references"/>
     <w:p>
       <w:pPr>
         <w:pStyle w:val="Heading2"/>
@@ -11027,7 +11095,7 @@
         <w:t xml:space="preserve">References</w:t>
       </w:r>
     </w:p>
-    <w:bookmarkStart w:id="95" w:name="refs"/>
+    <w:bookmarkStart w:id="97" w:name="refs"/>
     <w:bookmarkStart w:id="77" w:name="ref-arruda2024amortized"/>
     <w:p>
       <w:pPr>
@@ -11360,7 +11428,39 @@
       </w:r>
     </w:p>
     <w:bookmarkEnd w:id="85"/>
-    <w:bookmarkStart w:id="86" w:name="ref-oreilly1968studies"/>
+    <w:bookmarkStart w:id="86" w:name="ref-margossian2024amortized"/>
+    <w:p>
+      <w:pPr>
+        <w:pStyle w:val="Bibliography"/>
+      </w:pPr>
+      <w:r>
+        <w:t xml:space="preserve">Margossian, Charles C., and David M. Blei. 2024.</w:t>
+      </w:r>
+      <w:r>
+        <w:t xml:space="preserve"> </w:t>
+      </w:r>
+      <w:r>
+        <w:t xml:space="preserve">“Amortized Variational Inference: When and Why?”</w:t>
+      </w:r>
+      <w:r>
+        <w:t xml:space="preserve"> In</w:t>
+      </w:r>
+      <w:r>
+        <w:t xml:space="preserve"> </w:t>
+      </w:r>
+      <w:r>
+        <w:rPr>
+          <w:i/>
+          <w:iCs/>
+        </w:rPr>
+        <w:t xml:space="preserve">Proceedings of the Fortieth Conference on Uncertainty in Artificial Intelligence</w:t>
+      </w:r>
+      <w:r>
+        <w:t xml:space="preserve">, 244:2434–49. Proceedings of Machine Learning Research. PMLR.</w:t>
+      </w:r>
+    </w:p>
+    <w:bookmarkEnd w:id="86"/>
+    <w:bookmarkStart w:id="87" w:name="ref-oreilly1968studies"/>
     <w:p>
       <w:pPr>
         <w:pStyle w:val="Bibliography"/>
@@ -11391,8 +11491,8 @@
         <w:t xml:space="preserve">38 (1): 169–77.</w:t>
       </w:r>
     </w:p>
-    <w:bookmarkEnd w:id="86"/>
-    <w:bookmarkStart w:id="87" w:name="ref-papamakarios2021normalizing"/>
+    <w:bookmarkEnd w:id="87"/>
+    <w:bookmarkStart w:id="88" w:name="ref-papamakarios2021normalizing"/>
     <w:p>
       <w:pPr>
         <w:pStyle w:val="Bibliography"/>
@@ -11423,8 +11523,8 @@
         <w:t xml:space="preserve">22 (57): 1–64.</w:t>
       </w:r>
     </w:p>
-    <w:bookmarkEnd w:id="87"/>
-    <w:bookmarkStart w:id="88" w:name="ref-paszke2019pytorch"/>
+    <w:bookmarkEnd w:id="88"/>
+    <w:bookmarkStart w:id="89" w:name="ref-paszke2019pytorch"/>
     <w:p>
       <w:pPr>
         <w:pStyle w:val="Bibliography"/>
@@ -11464,8 +11564,8 @@
         <w:t xml:space="preserve">. Vol. 32.</w:t>
       </w:r>
     </w:p>
-    <w:bookmarkEnd w:id="88"/>
-    <w:bookmarkStart w:id="89" w:name="ref-pinheiro1994topics"/>
+    <w:bookmarkEnd w:id="89"/>
+    <w:bookmarkStart w:id="90" w:name="ref-pinheiro1994topics"/>
     <w:p>
       <w:pPr>
         <w:pStyle w:val="Bibliography"/>
@@ -11486,8 +11586,8 @@
         <w:t xml:space="preserve">PhD thesis, Madison, USA: University of Wisconsin, Madison.</w:t>
       </w:r>
     </w:p>
-    <w:bookmarkEnd w:id="89"/>
-    <w:bookmarkStart w:id="90" w:name="ref-rackauckas2017differentialequations"/>
+    <w:bookmarkEnd w:id="90"/>
+    <w:bookmarkStart w:id="91" w:name="ref-rackauckas2017differentialequations"/>
     <w:p>
       <w:pPr>
         <w:pStyle w:val="Bibliography"/>
@@ -11533,8 +11633,43 @@
         <w:t xml:space="preserve">5 (1).</w:t>
       </w:r>
     </w:p>
-    <w:bookmarkEnd w:id="90"/>
-    <w:bookmarkStart w:id="91" w:name="ref-rezende2015variational"/>
+    <w:bookmarkEnd w:id="91"/>
+    <w:bookmarkStart w:id="92" w:name="ref-rainforth2018tighter"/>
+    <w:p>
+      <w:pPr>
+        <w:pStyle w:val="Bibliography"/>
+      </w:pPr>
+      <w:r>
+        <w:t xml:space="preserve">Rainforth, Tom, Adam Kosiorek, Tuan Anh Le, Chris Maddison, Maximilian Igl, Frank Wood, and Yee Whye Teh. 2018.</w:t>
+      </w:r>
+      <w:r>
+        <w:t xml:space="preserve"> </w:t>
+      </w:r>
+      <w:r>
+        <w:t xml:space="preserve">“Tighter Variational Bounds Are Not Necessarily Better.”</w:t>
+      </w:r>
+      <w:r>
+        <w:t xml:space="preserve"> </w:t>
+      </w:r>
+      <w:r>
+        <w:t xml:space="preserve">In</w:t>
+      </w:r>
+      <w:r>
+        <w:t xml:space="preserve"> </w:t>
+      </w:r>
+      <w:r>
+        <w:rPr>
+          <w:i/>
+          <w:iCs/>
+        </w:rPr>
+        <w:t xml:space="preserve">Proceedings of the 35th International Conference on Machine Learning</w:t>
+      </w:r>
+      <w:r>
+        <w:t xml:space="preserve">, 80:4277–85. Proceedings of Machine Learning Research. PMLR.</w:t>
+      </w:r>
+    </w:p>
+    <w:bookmarkEnd w:id="92"/>
+    <w:bookmarkStart w:id="93" w:name="ref-rezende2015variational"/>
     <w:p>
       <w:pPr>
         <w:pStyle w:val="Bibliography"/>
@@ -11568,8 +11703,8 @@
         <w:t xml:space="preserve">, 1530–38. PMLR.</w:t>
       </w:r>
     </w:p>
-    <w:bookmarkEnd w:id="91"/>
-    <w:bookmarkStart w:id="92" w:name="ref-self1987asymptotic"/>
+    <w:bookmarkEnd w:id="93"/>
+    <w:bookmarkStart w:id="94" w:name="ref-self1987asymptotic"/>
     <w:p>
       <w:pPr>
         <w:pStyle w:val="Bibliography"/>
@@ -11600,8 +11735,8 @@
         <w:t xml:space="preserve">82 (398): 605–10.</w:t>
       </w:r>
     </w:p>
-    <w:bookmarkEnd w:id="92"/>
-    <w:bookmarkStart w:id="93" w:name="ref-tarek2026fitting"/>
+    <w:bookmarkEnd w:id="94"/>
+    <w:bookmarkStart w:id="95" w:name="ref-tarek2026fitting"/>
     <w:p>
       <w:pPr>
         <w:pStyle w:val="Bibliography"/>
@@ -11629,8 +11764,8 @@
         <w:t xml:space="preserve">.</w:t>
       </w:r>
     </w:p>
-    <w:bookmarkEnd w:id="93"/>
-    <w:bookmarkStart w:id="94" w:name="ref-wang2008derivation"/>
+    <w:bookmarkEnd w:id="95"/>
+    <w:bookmarkStart w:id="96" w:name="ref-wang2008derivation"/>
     <w:p>
       <w:pPr>
         <w:pStyle w:val="Bibliography"/>
@@ -11673,10 +11808,10 @@
         <w:t xml:space="preserve">35 (2): 249–49.</w:t>
       </w:r>
     </w:p>
-    <w:bookmarkEnd w:id="94"/>
-    <w:bookmarkEnd w:id="95"/>
     <w:bookmarkEnd w:id="96"/>
-    <w:bookmarkStart w:id="114" w:name="supplementary-material"/>
+    <w:bookmarkEnd w:id="97"/>
+    <w:bookmarkEnd w:id="98"/>
+    <w:bookmarkStart w:id="116" w:name="supplementary-material"/>
     <w:p>
       <w:pPr>
         <w:pStyle w:val="Heading2"/>
@@ -11685,7 +11820,7 @@
         <w:t xml:space="preserve">Supplementary Material</w:t>
       </w:r>
     </w:p>
-    <w:bookmarkStart w:id="104" w:name="supplementary-tables"/>
+    <w:bookmarkStart w:id="106" w:name="supplementary-tables"/>
     <w:p>
       <w:pPr>
         <w:pStyle w:val="Heading3"/>
@@ -11707,7 +11842,7 @@
       <w:tr>
         <w:tc>
           <w:tcPr/>
-          <w:bookmarkStart w:id="97" w:name="supptbl-phase0-combined"/>
+          <w:bookmarkStart w:id="99" w:name="supptbl-phase0-combined"/>
           <w:tbl>
             <w:tblPr>
               <w:tblStyle w:val="Table"/>
@@ -13021,7 +13156,7 @@
               <w:t xml:space="preserve">) are reported as standard deviations.</w:t>
             </w:r>
           </w:p>
-          <w:bookmarkEnd w:id="97"/>
+          <w:bookmarkEnd w:id="99"/>
         </w:tc>
       </w:tr>
     </w:tbl>
@@ -13046,7 +13181,7 @@
       <w:tr>
         <w:tc>
           <w:tcPr/>
-          <w:bookmarkStart w:id="98" w:name="supptbl-phase1-dense"/>
+          <w:bookmarkStart w:id="100" w:name="supptbl-phase1-dense"/>
           <w:tbl>
             <w:tblPr>
               <w:tblStyle w:val="Table"/>
@@ -15208,7 +15343,7 @@
               <w:t xml:space="preserve">) are reported as standard deviations.</w:t>
             </w:r>
           </w:p>
-          <w:bookmarkEnd w:id="98"/>
+          <w:bookmarkEnd w:id="100"/>
         </w:tc>
       </w:tr>
     </w:tbl>
@@ -15233,7 +15368,7 @@
       <w:tr>
         <w:tc>
           <w:tcPr/>
-          <w:bookmarkStart w:id="99" w:name="supptbl-phase1-sparse"/>
+          <w:bookmarkStart w:id="101" w:name="supptbl-phase1-sparse"/>
           <w:tbl>
             <w:tblPr>
               <w:tblStyle w:val="Table"/>
@@ -17395,7 +17530,7 @@
               <w:t xml:space="preserve">) are reported as standard deviations.</w:t>
             </w:r>
           </w:p>
-          <w:bookmarkEnd w:id="99"/>
+          <w:bookmarkEnd w:id="101"/>
         </w:tc>
       </w:tr>
     </w:tbl>
@@ -17420,7 +17555,7 @@
       <w:tr>
         <w:tc>
           <w:tcPr/>
-          <w:bookmarkStart w:id="100" w:name="supptbl-phase1-q3-nonlinear"/>
+          <w:bookmarkStart w:id="102" w:name="supptbl-phase1-q3-nonlinear"/>
           <w:tbl>
             <w:tblPr>
               <w:tblStyle w:val="Table"/>
@@ -17993,7 +18128,7 @@
               <w:t xml:space="preserve">. Relative bias (%) is shown in parentheses; ground-truth values are provided for reference.</w:t>
             </w:r>
           </w:p>
-          <w:bookmarkEnd w:id="100"/>
+          <w:bookmarkEnd w:id="102"/>
         </w:tc>
       </w:tr>
     </w:tbl>
@@ -18018,7 +18153,7 @@
       <w:tr>
         <w:tc>
           <w:tcPr/>
-          <w:bookmarkStart w:id="101" w:name="supptbl-realdata-k1-vs-khigh"/>
+          <w:bookmarkStart w:id="103" w:name="supptbl-realdata-k1-vs-khigh"/>
           <w:tbl>
             <w:tblPr>
               <w:tblStyle w:val="Table"/>
@@ -19177,7 +19312,7 @@
               <w:t xml:space="preserve">for the theophylline and warfarin datasets, with percent difference between the two estimates.</w:t>
             </w:r>
           </w:p>
-          <w:bookmarkEnd w:id="101"/>
+          <w:bookmarkEnd w:id="103"/>
         </w:tc>
       </w:tr>
     </w:tbl>
@@ -19202,7 +19337,7 @@
       <w:tr>
         <w:tc>
           <w:tcPr/>
-          <w:bookmarkStart w:id="102" w:name="supptbl-psis-ess"/>
+          <w:bookmarkStart w:id="104" w:name="supptbl-psis-ess"/>
           <w:tbl>
             <w:tblPr>
               <w:tblStyle w:val="Table"/>
@@ -19419,7 +19554,7 @@
               <w:t xml:space="preserve">Table S6: Aggregate importance-sampling effective sample size by fit-quality arm.</w:t>
             </w:r>
           </w:p>
-          <w:bookmarkEnd w:id="102"/>
+          <w:bookmarkEnd w:id="104"/>
         </w:tc>
       </w:tr>
     </w:tbl>
@@ -19444,7 +19579,7 @@
       <w:tr>
         <w:tc>
           <w:tcPr/>
-          <w:bookmarkStart w:id="103" w:name="supptbl-deltaofv-calibration"/>
+          <w:bookmarkStart w:id="105" w:name="supptbl-deltaofv-calibration"/>
           <w:tbl>
             <w:tblPr>
               <w:tblStyle w:val="Table"/>
@@ -19753,12 +19888,12 @@
               <w:t xml:space="preserve">for the strictly positive replicates, and empirical type-I error using the correct Self-Liang boundary-mixture cutoff.</w:t>
             </w:r>
           </w:p>
-          <w:bookmarkEnd w:id="103"/>
+          <w:bookmarkEnd w:id="105"/>
         </w:tc>
       </w:tr>
     </w:tbl>
-    <w:bookmarkEnd w:id="104"/>
-    <w:bookmarkStart w:id="113" w:name="supplementary-figures"/>
+    <w:bookmarkEnd w:id="106"/>
+    <w:bookmarkStart w:id="115" w:name="supplementary-figures"/>
     <w:p>
       <w:pPr>
         <w:pStyle w:val="Heading3"/>
@@ -19780,7 +19915,7 @@
       <w:tr>
         <w:tc>
           <w:tcPr/>
-          <w:bookmarkStart w:id="108" w:name="suppfig-phase0-fixed-effects"/>
+          <w:bookmarkStart w:id="110" w:name="suppfig-phase0-fixed-effects"/>
           <w:p>
             <w:pPr>
               <w:pStyle w:val="Compact"/>
@@ -19791,18 +19926,18 @@
                 <wp:inline>
                   <wp:extent cx="5334000" cy="2438400"/>
                   <wp:effectExtent b="0" l="0" r="0" t="0"/>
-                  <wp:docPr descr="" title="" id="106" name="Picture"/>
+                  <wp:docPr descr="" title="" id="108" name="Picture"/>
                   <a:graphic>
                     <a:graphicData uri="http://schemas.openxmlformats.org/drawingml/2006/picture">
                       <pic:pic>
                         <pic:nvPicPr>
-                          <pic:cNvPr descr="publication/figures/fig_phase0_fixed_effects.png" id="107" name="Picture"/>
+                          <pic:cNvPr descr="publication/figures/fig_phase0_fixed_effects.png" id="109" name="Picture"/>
                           <pic:cNvPicPr>
                             <a:picLocks noChangeArrowheads="1" noChangeAspect="1"/>
                           </pic:cNvPicPr>
                         </pic:nvPicPr>
                         <pic:blipFill>
-                          <a:blip r:embed="rId105"/>
+                          <a:blip r:embed="rId107"/>
                           <a:stretch>
                             <a:fillRect/>
                           </a:stretch>
@@ -19853,7 +19988,7 @@
               <w:t xml:space="preserve">, shown separately for free and amortized posteriors in the Phase 0 Gaussian analysis. The dashed line marks zero bias; error bars show the standard error across replicates.</w:t>
             </w:r>
           </w:p>
-          <w:bookmarkEnd w:id="108"/>
+          <w:bookmarkEnd w:id="110"/>
         </w:tc>
       </w:tr>
     </w:tbl>
@@ -19878,7 +20013,7 @@
       <w:tr>
         <w:tc>
           <w:tcPr/>
-          <w:bookmarkStart w:id="112" w:name="suppfig-phase1-fixed-effects"/>
+          <w:bookmarkStart w:id="114" w:name="suppfig-phase1-fixed-effects"/>
           <w:p>
             <w:pPr>
               <w:pStyle w:val="Compact"/>
@@ -19889,18 +20024,18 @@
                 <wp:inline>
                   <wp:extent cx="5334000" cy="2963333"/>
                   <wp:effectExtent b="0" l="0" r="0" t="0"/>
-                  <wp:docPr descr="" title="" id="110" name="Picture"/>
+                  <wp:docPr descr="" title="" id="112" name="Picture"/>
                   <a:graphic>
                     <a:graphicData uri="http://schemas.openxmlformats.org/drawingml/2006/picture">
                       <pic:pic>
                         <pic:nvPicPr>
-                          <pic:cNvPr descr="publication/figures/fig_phase1_grid_fixed_effects.png" id="111" name="Picture"/>
+                          <pic:cNvPr descr="publication/figures/fig_phase1_grid_fixed_effects.png" id="113" name="Picture"/>
                           <pic:cNvPicPr>
                             <a:picLocks noChangeArrowheads="1" noChangeAspect="1"/>
                           </pic:cNvPicPr>
                         </pic:nvPicPr>
                         <pic:blipFill>
-                          <a:blip r:embed="rId109"/>
+                          <a:blip r:embed="rId111"/>
                           <a:stretch>
                             <a:fillRect/>
                           </a:stretch>
@@ -19965,12 +20100,12 @@
               <w:t xml:space="preserve">.</w:t>
             </w:r>
           </w:p>
-          <w:bookmarkEnd w:id="112"/>
+          <w:bookmarkEnd w:id="114"/>
         </w:tc>
       </w:tr>
     </w:tbl>
-    <w:bookmarkEnd w:id="113"/>
-    <w:bookmarkEnd w:id="114"/>
+    <w:bookmarkEnd w:id="115"/>
+    <w:bookmarkEnd w:id="116"/>
     <w:sectPr>
       <w:footnotePr>
         <w:numRestart w:val="eachSect"/>

</xml_diff>

<commit_message>
fix table captions for manuscript
</commit_message>
<xml_diff>
--- a/manuscript_copyedited.docx
+++ b/manuscript_copyedited.docx
@@ -11843,6 +11843,27 @@
         <w:tc>
           <w:tcPr/>
           <w:bookmarkStart w:id="99" w:name="supptbl-phase0-combined"/>
+          <w:p>
+            <w:pPr>
+              <w:jc w:val="center"/>
+            </w:pPr>
+            <w:pPr>
+              <w:jc w:val="left"/>
+              <w:spacing w:before="200"/>
+              <w:pStyle w:val="ImageCaption"/>
+            </w:pPr>
+            <w:r>
+              <w:t xml:space="preserve">Table S1: Values are mean relative bias (%) with the standard deviation across replicates in parentheses. BSV, between-subject variability; RUV, residual unexplained variability. BSV parameters (</w:t>
+            </w:r>
+            <m:oMath>
+              <m:r>
+                <m:t>ω</m:t>
+              </m:r>
+            </m:oMath>
+            <w:r>
+              <w:t xml:space="preserve">) are reported as standard deviations.</w:t>
+            </w:r>
+          </w:p>
           <w:tbl>
             <w:tblPr>
               <w:tblStyle w:val="Table"/>
@@ -13135,28 +13156,8 @@
               </w:tc>
             </w:tr>
           </w:tbl>
-          <w:p>
-            <w:pPr>
-              <w:jc w:val="center"/>
-            </w:pPr>
-            <w:pPr>
-              <w:jc w:val="left"/>
-              <w:spacing w:before="200"/>
-              <w:pStyle w:val="ImageCaption"/>
-            </w:pPr>
-            <w:r>
-              <w:t xml:space="preserve">Table S1: Values are mean relative bias (%) with the standard deviation across replicates in parentheses. BSV, between-subject variability; RUV, residual unexplained variability. BSV parameters (</w:t>
-            </w:r>
-            <m:oMath>
-              <m:r>
-                <m:t>ω</m:t>
-              </m:r>
-            </m:oMath>
-            <w:r>
-              <w:t xml:space="preserve">) are reported as standard deviations.</w:t>
-            </w:r>
-          </w:p>
           <w:bookmarkEnd w:id="99"/>
+          <w:p/>
         </w:tc>
       </w:tr>
     </w:tbl>
@@ -13182,6 +13183,27 @@
         <w:tc>
           <w:tcPr/>
           <w:bookmarkStart w:id="100" w:name="supptbl-phase1-dense"/>
+          <w:p>
+            <w:pPr>
+              <w:jc w:val="center"/>
+            </w:pPr>
+            <w:pPr>
+              <w:jc w:val="left"/>
+              <w:spacing w:before="200"/>
+              <w:pStyle w:val="ImageCaption"/>
+            </w:pPr>
+            <w:r>
+              <w:t xml:space="preserve">Table S2: Values are mean relative bias (%) with the standard deviation across replicates in parentheses. BSV, between-subject variability; RUV, residual unexplained variability. BSV parameters (</w:t>
+            </w:r>
+            <m:oMath>
+              <m:r>
+                <m:t>ω</m:t>
+              </m:r>
+            </m:oMath>
+            <w:r>
+              <w:t xml:space="preserve">) are reported as standard deviations.</w:t>
+            </w:r>
+          </w:p>
           <w:tbl>
             <w:tblPr>
               <w:tblStyle w:val="Table"/>
@@ -15322,28 +15344,8 @@
               </w:tc>
             </w:tr>
           </w:tbl>
-          <w:p>
-            <w:pPr>
-              <w:jc w:val="center"/>
-            </w:pPr>
-            <w:pPr>
-              <w:jc w:val="left"/>
-              <w:spacing w:before="200"/>
-              <w:pStyle w:val="ImageCaption"/>
-            </w:pPr>
-            <w:r>
-              <w:t xml:space="preserve">Table S2: Values are mean relative bias (%) with the standard deviation across replicates in parentheses. BSV, between-subject variability; RUV, residual unexplained variability. BSV parameters (</w:t>
-            </w:r>
-            <m:oMath>
-              <m:r>
-                <m:t>ω</m:t>
-              </m:r>
-            </m:oMath>
-            <w:r>
-              <w:t xml:space="preserve">) are reported as standard deviations.</w:t>
-            </w:r>
-          </w:p>
           <w:bookmarkEnd w:id="100"/>
+          <w:p/>
         </w:tc>
       </w:tr>
     </w:tbl>
@@ -15369,6 +15371,27 @@
         <w:tc>
           <w:tcPr/>
           <w:bookmarkStart w:id="101" w:name="supptbl-phase1-sparse"/>
+          <w:p>
+            <w:pPr>
+              <w:jc w:val="center"/>
+            </w:pPr>
+            <w:pPr>
+              <w:jc w:val="left"/>
+              <w:spacing w:before="200"/>
+              <w:pStyle w:val="ImageCaption"/>
+            </w:pPr>
+            <w:r>
+              <w:t xml:space="preserve">Table S3: Values are mean relative bias (%) with the standard deviation across replicates in parentheses. BSV, between-subject variability; RUV, residual unexplained variability. BSV parameters (</w:t>
+            </w:r>
+            <m:oMath>
+              <m:r>
+                <m:t>ω</m:t>
+              </m:r>
+            </m:oMath>
+            <w:r>
+              <w:t xml:space="preserve">) are reported as standard deviations.</w:t>
+            </w:r>
+          </w:p>
           <w:tbl>
             <w:tblPr>
               <w:tblStyle w:val="Table"/>
@@ -17509,28 +17532,8 @@
               </w:tc>
             </w:tr>
           </w:tbl>
-          <w:p>
-            <w:pPr>
-              <w:jc w:val="center"/>
-            </w:pPr>
-            <w:pPr>
-              <w:jc w:val="left"/>
-              <w:spacing w:before="200"/>
-              <w:pStyle w:val="ImageCaption"/>
-            </w:pPr>
-            <w:r>
-              <w:t xml:space="preserve">Table S3: Values are mean relative bias (%) with the standard deviation across replicates in parentheses. BSV, between-subject variability; RUV, residual unexplained variability. BSV parameters (</w:t>
-            </w:r>
-            <m:oMath>
-              <m:r>
-                <m:t>ω</m:t>
-              </m:r>
-            </m:oMath>
-            <w:r>
-              <w:t xml:space="preserve">) are reported as standard deviations.</w:t>
-            </w:r>
-          </w:p>
           <w:bookmarkEnd w:id="101"/>
+          <w:p/>
         </w:tc>
       </w:tr>
     </w:tbl>
@@ -17556,6 +17559,30 @@
         <w:tc>
           <w:tcPr/>
           <w:bookmarkStart w:id="102" w:name="supptbl-phase1-q3-nonlinear"/>
+          <w:p>
+            <w:pPr>
+              <w:jc w:val="center"/>
+            </w:pPr>
+            <w:pPr>
+              <w:jc w:val="left"/>
+              <w:spacing w:before="200"/>
+              <w:pStyle w:val="ImageCaption"/>
+            </w:pPr>
+            <w:r>
+              <w:t xml:space="preserve">Table S4: Mean parameter estimates for the Michaelis-Menten elimination model at each</w:t>
+            </w:r>
+            <w:r>
+              <w:t xml:space="preserve"> </w:t>
+            </w:r>
+            <m:oMath>
+              <m:r>
+                <m:t>K</m:t>
+              </m:r>
+            </m:oMath>
+            <w:r>
+              <w:t xml:space="preserve">. Relative bias (%) is shown in parentheses; ground-truth values are provided for reference.</w:t>
+            </w:r>
+          </w:p>
           <w:tbl>
             <w:tblPr>
               <w:tblStyle w:val="Table"/>
@@ -18104,31 +18131,8 @@
               </w:tc>
             </w:tr>
           </w:tbl>
-          <w:p>
-            <w:pPr>
-              <w:jc w:val="center"/>
-            </w:pPr>
-            <w:pPr>
-              <w:jc w:val="left"/>
-              <w:spacing w:before="200"/>
-              <w:pStyle w:val="ImageCaption"/>
-            </w:pPr>
-            <w:r>
-              <w:t xml:space="preserve">Table S4: Mean parameter estimates for the Michaelis-Menten elimination model at each</w:t>
-            </w:r>
-            <w:r>
-              <w:t xml:space="preserve"> </w:t>
-            </w:r>
-            <m:oMath>
-              <m:r>
-                <m:t>K</m:t>
-              </m:r>
-            </m:oMath>
-            <w:r>
-              <w:t xml:space="preserve">. Relative bias (%) is shown in parentheses; ground-truth values are provided for reference.</w:t>
-            </w:r>
-          </w:p>
           <w:bookmarkEnd w:id="102"/>
+          <w:p/>
         </w:tc>
       </w:tr>
     </w:tbl>
@@ -18154,1105 +18158,6 @@
         <w:tc>
           <w:tcPr/>
           <w:bookmarkStart w:id="103" w:name="supptbl-realdata-k1-vs-khigh"/>
-          <w:tbl>
-            <w:tblPr>
-              <w:tblStyle w:val="Table"/>
-              <w:tblW w:type="auto" w:w="0"/>
-              <w:tblLook w:firstRow="1" w:lastRow="0" w:firstColumn="0" w:lastColumn="0" w:noHBand="0" w:noVBand="0" w:val="0020"/>
-            </w:tblPr>
-            <w:tblGrid>
-              <w:gridCol w:w="1584"/>
-              <w:gridCol w:w="1584"/>
-              <w:gridCol w:w="1584"/>
-              <w:gridCol w:w="1584"/>
-              <w:gridCol w:w="1584"/>
-            </w:tblGrid>
-            <w:tr>
-              <w:trPr>
-                <w:tblHeader w:val="on"/>
-              </w:trPr>
-              <w:tc>
-                <w:tcPr/>
-                <w:p>
-                  <w:pPr>
-                    <w:pStyle w:val="Compact"/>
-                    <w:jc w:val="center"/>
-                  </w:pPr>
-                  <w:r>
-                    <w:t xml:space="preserve">Dataset</w:t>
-                  </w:r>
-                </w:p>
-              </w:tc>
-              <w:tc>
-                <w:tcPr/>
-                <w:p>
-                  <w:pPr>
-                    <w:pStyle w:val="Compact"/>
-                    <w:jc w:val="center"/>
-                  </w:pPr>
-                  <w:r>
-                    <w:t xml:space="preserve">Parameter</w:t>
-                  </w:r>
-                </w:p>
-              </w:tc>
-              <w:tc>
-                <w:tcPr/>
-                <w:p>
-                  <w:pPr>
-                    <w:pStyle w:val="Compact"/>
-                    <w:jc w:val="center"/>
-                  </w:pPr>
-                  <m:oMath>
-                    <m:r>
-                      <m:t>K</m:t>
-                    </m:r>
-                    <m:r>
-                      <m:rPr>
-                        <m:sty m:val="p"/>
-                      </m:rPr>
-                      <m:t>=</m:t>
-                    </m:r>
-                    <m:r>
-                      <m:t>1</m:t>
-                    </m:r>
-                  </m:oMath>
-                </w:p>
-              </w:tc>
-              <w:tc>
-                <w:tcPr/>
-                <w:p>
-                  <w:pPr>
-                    <w:pStyle w:val="Compact"/>
-                    <w:jc w:val="center"/>
-                  </w:pPr>
-                  <m:oMath>
-                    <m:r>
-                      <m:t>K</m:t>
-                    </m:r>
-                    <m:r>
-                      <m:rPr>
-                        <m:sty m:val="p"/>
-                      </m:rPr>
-                      <m:t>=</m:t>
-                    </m:r>
-                    <m:r>
-                      <m:t>64</m:t>
-                    </m:r>
-                  </m:oMath>
-                </w:p>
-              </w:tc>
-              <w:tc>
-                <w:tcPr/>
-                <w:p>
-                  <w:pPr>
-                    <w:pStyle w:val="Compact"/>
-                    <w:jc w:val="center"/>
-                  </w:pPr>
-                  <w:r>
-                    <w:t xml:space="preserve">Difference (%)</w:t>
-                  </w:r>
-                </w:p>
-              </w:tc>
-            </w:tr>
-            <w:tr>
-              <w:tc>
-                <w:tcPr/>
-                <w:p>
-                  <w:pPr>
-                    <w:pStyle w:val="Compact"/>
-                    <w:jc w:val="center"/>
-                  </w:pPr>
-                  <w:r>
-                    <w:t xml:space="preserve">theophylline</w:t>
-                  </w:r>
-                </w:p>
-              </w:tc>
-              <w:tc>
-                <w:tcPr/>
-                <w:p>
-                  <w:pPr>
-                    <w:pStyle w:val="Compact"/>
-                    <w:jc w:val="center"/>
-                  </w:pPr>
-                  <m:oMath>
-                    <m:r>
-                      <m:t>C</m:t>
-                    </m:r>
-                    <m:r>
-                      <m:t>L</m:t>
-                    </m:r>
-                  </m:oMath>
-                </w:p>
-              </w:tc>
-              <w:tc>
-                <w:tcPr/>
-                <w:p>
-                  <w:pPr>
-                    <w:pStyle w:val="Compact"/>
-                    <w:jc w:val="center"/>
-                  </w:pPr>
-                  <w:r>
-                    <w:t xml:space="preserve">0.04</w:t>
-                  </w:r>
-                </w:p>
-              </w:tc>
-              <w:tc>
-                <w:tcPr/>
-                <w:p>
-                  <w:pPr>
-                    <w:pStyle w:val="Compact"/>
-                    <w:jc w:val="center"/>
-                  </w:pPr>
-                  <w:r>
-                    <w:t xml:space="preserve">0.0403</w:t>
-                  </w:r>
-                </w:p>
-              </w:tc>
-              <w:tc>
-                <w:tcPr/>
-                <w:p>
-                  <w:pPr>
-                    <w:pStyle w:val="Compact"/>
-                    <w:jc w:val="center"/>
-                  </w:pPr>
-                  <w:r>
-                    <w:t xml:space="preserve">-0.882</w:t>
-                  </w:r>
-                </w:p>
-              </w:tc>
-            </w:tr>
-            <w:tr>
-              <w:tc>
-                <w:tcPr/>
-                <w:p>
-                  <w:pPr>
-                    <w:pStyle w:val="Compact"/>
-                    <w:jc w:val="center"/>
-                  </w:pPr>
-                  <w:r>
-                    <w:t xml:space="preserve">theophylline</w:t>
-                  </w:r>
-                </w:p>
-              </w:tc>
-              <w:tc>
-                <w:tcPr/>
-                <w:p>
-                  <w:pPr>
-                    <w:pStyle w:val="Compact"/>
-                    <w:jc w:val="center"/>
-                  </w:pPr>
-                  <m:oMath>
-                    <m:r>
-                      <m:t>V</m:t>
-                    </m:r>
-                  </m:oMath>
-                </w:p>
-              </w:tc>
-              <w:tc>
-                <w:tcPr/>
-                <w:p>
-                  <w:pPr>
-                    <w:pStyle w:val="Compact"/>
-                    <w:jc w:val="center"/>
-                  </w:pPr>
-                  <w:r>
-                    <w:t xml:space="preserve">0.462</w:t>
-                  </w:r>
-                </w:p>
-              </w:tc>
-              <w:tc>
-                <w:tcPr/>
-                <w:p>
-                  <w:pPr>
-                    <w:pStyle w:val="Compact"/>
-                    <w:jc w:val="center"/>
-                  </w:pPr>
-                  <w:r>
-                    <w:t xml:space="preserve">0.452</w:t>
-                  </w:r>
-                </w:p>
-              </w:tc>
-              <w:tc>
-                <w:tcPr/>
-                <w:p>
-                  <w:pPr>
-                    <w:pStyle w:val="Compact"/>
-                    <w:jc w:val="center"/>
-                  </w:pPr>
-                  <w:r>
-                    <w:t xml:space="preserve">2.35</w:t>
-                  </w:r>
-                </w:p>
-              </w:tc>
-            </w:tr>
-            <w:tr>
-              <w:tc>
-                <w:tcPr/>
-                <w:p>
-                  <w:pPr>
-                    <w:pStyle w:val="Compact"/>
-                    <w:jc w:val="center"/>
-                  </w:pPr>
-                  <w:r>
-                    <w:t xml:space="preserve">theophylline</w:t>
-                  </w:r>
-                </w:p>
-              </w:tc>
-              <w:tc>
-                <w:tcPr/>
-                <w:p>
-                  <w:pPr>
-                    <w:pStyle w:val="Compact"/>
-                    <w:jc w:val="center"/>
-                  </w:pPr>
-                  <m:oMath>
-                    <m:sSub>
-                      <m:e>
-                        <m:r>
-                          <m:t>k</m:t>
-                        </m:r>
-                      </m:e>
-                      <m:sub>
-                        <m:r>
-                          <m:t>a</m:t>
-                        </m:r>
-                      </m:sub>
-                    </m:sSub>
-                  </m:oMath>
-                </w:p>
-              </w:tc>
-              <w:tc>
-                <w:tcPr/>
-                <w:p>
-                  <w:pPr>
-                    <w:pStyle w:val="Compact"/>
-                    <w:jc w:val="center"/>
-                  </w:pPr>
-                  <w:r>
-                    <w:t xml:space="preserve">1.29</w:t>
-                  </w:r>
-                </w:p>
-              </w:tc>
-              <w:tc>
-                <w:tcPr/>
-                <w:p>
-                  <w:pPr>
-                    <w:pStyle w:val="Compact"/>
-                    <w:jc w:val="center"/>
-                  </w:pPr>
-                  <w:r>
-                    <w:t xml:space="preserve">1.34</w:t>
-                  </w:r>
-                </w:p>
-              </w:tc>
-              <w:tc>
-                <w:tcPr/>
-                <w:p>
-                  <w:pPr>
-                    <w:pStyle w:val="Compact"/>
-                    <w:jc w:val="center"/>
-                  </w:pPr>
-                  <w:r>
-                    <w:t xml:space="preserve">-4.27</w:t>
-                  </w:r>
-                </w:p>
-              </w:tc>
-            </w:tr>
-            <w:tr>
-              <w:tc>
-                <w:tcPr/>
-                <w:p>
-                  <w:pPr>
-                    <w:pStyle w:val="Compact"/>
-                    <w:jc w:val="center"/>
-                  </w:pPr>
-                  <w:r>
-                    <w:t xml:space="preserve">theophylline</w:t>
-                  </w:r>
-                </w:p>
-              </w:tc>
-              <w:tc>
-                <w:tcPr/>
-                <w:p>
-                  <w:pPr>
-                    <w:pStyle w:val="Compact"/>
-                    <w:jc w:val="center"/>
-                  </w:pPr>
-                  <m:oMath>
-                    <m:sSub>
-                      <m:e>
-                        <m:r>
-                          <m:t>ω</m:t>
-                        </m:r>
-                      </m:e>
-                      <m:sub>
-                        <m:r>
-                          <m:t>C</m:t>
-                        </m:r>
-                        <m:r>
-                          <m:t>L</m:t>
-                        </m:r>
-                      </m:sub>
-                    </m:sSub>
-                  </m:oMath>
-                </w:p>
-              </w:tc>
-              <w:tc>
-                <w:tcPr/>
-                <w:p>
-                  <w:pPr>
-                    <w:pStyle w:val="Compact"/>
-                    <w:jc w:val="center"/>
-                  </w:pPr>
-                  <w:r>
-                    <w:t xml:space="preserve">0.245</w:t>
-                  </w:r>
-                </w:p>
-              </w:tc>
-              <w:tc>
-                <w:tcPr/>
-                <w:p>
-                  <w:pPr>
-                    <w:pStyle w:val="Compact"/>
-                    <w:jc w:val="center"/>
-                  </w:pPr>
-                  <w:r>
-                    <w:t xml:space="preserve">0.255</w:t>
-                  </w:r>
-                </w:p>
-              </w:tc>
-              <w:tc>
-                <w:tcPr/>
-                <w:p>
-                  <w:pPr>
-                    <w:pStyle w:val="Compact"/>
-                    <w:jc w:val="center"/>
-                  </w:pPr>
-                  <w:r>
-                    <w:t xml:space="preserve">-3.81</w:t>
-                  </w:r>
-                </w:p>
-              </w:tc>
-            </w:tr>
-            <w:tr>
-              <w:tc>
-                <w:tcPr/>
-                <w:p>
-                  <w:pPr>
-                    <w:pStyle w:val="Compact"/>
-                    <w:jc w:val="center"/>
-                  </w:pPr>
-                  <w:r>
-                    <w:t xml:space="preserve">theophylline</w:t>
-                  </w:r>
-                </w:p>
-              </w:tc>
-              <w:tc>
-                <w:tcPr/>
-                <w:p>
-                  <w:pPr>
-                    <w:pStyle w:val="Compact"/>
-                    <w:jc w:val="center"/>
-                  </w:pPr>
-                  <m:oMath>
-                    <m:sSub>
-                      <m:e>
-                        <m:r>
-                          <m:t>ω</m:t>
-                        </m:r>
-                      </m:e>
-                      <m:sub>
-                        <m:r>
-                          <m:t>V</m:t>
-                        </m:r>
-                      </m:sub>
-                    </m:sSub>
-                  </m:oMath>
-                </w:p>
-              </w:tc>
-              <w:tc>
-                <w:tcPr/>
-                <w:p>
-                  <w:pPr>
-                    <w:pStyle w:val="Compact"/>
-                    <w:jc w:val="center"/>
-                  </w:pPr>
-                  <w:r>
-                    <w:t xml:space="preserve">0.0921</w:t>
-                  </w:r>
-                </w:p>
-              </w:tc>
-              <w:tc>
-                <w:tcPr/>
-                <w:p>
-                  <w:pPr>
-                    <w:pStyle w:val="Compact"/>
-                    <w:jc w:val="center"/>
-                  </w:pPr>
-                  <w:r>
-                    <w:t xml:space="preserve">0.113</w:t>
-                  </w:r>
-                </w:p>
-              </w:tc>
-              <w:tc>
-                <w:tcPr/>
-                <w:p>
-                  <w:pPr>
-                    <w:pStyle w:val="Compact"/>
-                    <w:jc w:val="center"/>
-                  </w:pPr>
-                  <w:r>
-                    <w:t xml:space="preserve">-18.2</w:t>
-                  </w:r>
-                </w:p>
-              </w:tc>
-            </w:tr>
-            <w:tr>
-              <w:tc>
-                <w:tcPr/>
-                <w:p>
-                  <w:pPr>
-                    <w:pStyle w:val="Compact"/>
-                    <w:jc w:val="center"/>
-                  </w:pPr>
-                  <w:r>
-                    <w:t xml:space="preserve">theophylline</w:t>
-                  </w:r>
-                </w:p>
-              </w:tc>
-              <w:tc>
-                <w:tcPr/>
-                <w:p>
-                  <w:pPr>
-                    <w:pStyle w:val="Compact"/>
-                    <w:jc w:val="center"/>
-                  </w:pPr>
-                  <m:oMath>
-                    <m:sSub>
-                      <m:e>
-                        <m:r>
-                          <m:t>ω</m:t>
-                        </m:r>
-                      </m:e>
-                      <m:sub>
-                        <m:sSub>
-                          <m:e>
-                            <m:r>
-                              <m:t>k</m:t>
-                            </m:r>
-                          </m:e>
-                          <m:sub>
-                            <m:r>
-                              <m:t>a</m:t>
-                            </m:r>
-                          </m:sub>
-                        </m:sSub>
-                      </m:sub>
-                    </m:sSub>
-                  </m:oMath>
-                </w:p>
-              </w:tc>
-              <w:tc>
-                <w:tcPr/>
-                <w:p>
-                  <w:pPr>
-                    <w:pStyle w:val="Compact"/>
-                    <w:jc w:val="center"/>
-                  </w:pPr>
-                  <w:r>
-                    <w:t xml:space="preserve">0.646</w:t>
-                  </w:r>
-                </w:p>
-              </w:tc>
-              <w:tc>
-                <w:tcPr/>
-                <w:p>
-                  <w:pPr>
-                    <w:pStyle w:val="Compact"/>
-                    <w:jc w:val="center"/>
-                  </w:pPr>
-                  <w:r>
-                    <w:t xml:space="preserve">0.682</w:t>
-                  </w:r>
-                </w:p>
-              </w:tc>
-              <w:tc>
-                <w:tcPr/>
-                <w:p>
-                  <w:pPr>
-                    <w:pStyle w:val="Compact"/>
-                    <w:jc w:val="center"/>
-                  </w:pPr>
-                  <w:r>
-                    <w:t xml:space="preserve">-5.22</w:t>
-                  </w:r>
-                </w:p>
-              </w:tc>
-            </w:tr>
-            <w:tr>
-              <w:tc>
-                <w:tcPr/>
-                <w:p>
-                  <w:pPr>
-                    <w:pStyle w:val="Compact"/>
-                    <w:jc w:val="center"/>
-                  </w:pPr>
-                  <w:r>
-                    <w:t xml:space="preserve">theophylline</w:t>
-                  </w:r>
-                </w:p>
-              </w:tc>
-              <w:tc>
-                <w:tcPr/>
-                <w:p>
-                  <w:pPr>
-                    <w:pStyle w:val="Compact"/>
-                    <w:jc w:val="center"/>
-                  </w:pPr>
-                  <m:oMath>
-                    <m:r>
-                      <m:t>σ</m:t>
-                    </m:r>
-                  </m:oMath>
-                </w:p>
-              </w:tc>
-              <w:tc>
-                <w:tcPr/>
-                <w:p>
-                  <w:pPr>
-                    <w:pStyle w:val="Compact"/>
-                    <w:jc w:val="center"/>
-                  </w:pPr>
-                  <w:r>
-                    <w:t xml:space="preserve">0.18</w:t>
-                  </w:r>
-                </w:p>
-              </w:tc>
-              <w:tc>
-                <w:tcPr/>
-                <w:p>
-                  <w:pPr>
-                    <w:pStyle w:val="Compact"/>
-                    <w:jc w:val="center"/>
-                  </w:pPr>
-                  <w:r>
-                    <w:t xml:space="preserve">0.172</w:t>
-                  </w:r>
-                </w:p>
-              </w:tc>
-              <w:tc>
-                <w:tcPr/>
-                <w:p>
-                  <w:pPr>
-                    <w:pStyle w:val="Compact"/>
-                    <w:jc w:val="center"/>
-                  </w:pPr>
-                  <w:r>
-                    <w:t xml:space="preserve">4.82</w:t>
-                  </w:r>
-                </w:p>
-              </w:tc>
-            </w:tr>
-            <w:tr>
-              <w:tc>
-                <w:tcPr/>
-                <w:p>
-                  <w:pPr>
-                    <w:pStyle w:val="Compact"/>
-                    <w:jc w:val="center"/>
-                  </w:pPr>
-                  <w:r>
-                    <w:t xml:space="preserve">warfarin</w:t>
-                  </w:r>
-                </w:p>
-              </w:tc>
-              <w:tc>
-                <w:tcPr/>
-                <w:p>
-                  <w:pPr>
-                    <w:pStyle w:val="Compact"/>
-                    <w:jc w:val="center"/>
-                  </w:pPr>
-                  <m:oMath>
-                    <m:r>
-                      <m:t>C</m:t>
-                    </m:r>
-                    <m:r>
-                      <m:t>L</m:t>
-                    </m:r>
-                  </m:oMath>
-                </w:p>
-              </w:tc>
-              <w:tc>
-                <w:tcPr/>
-                <w:p>
-                  <w:pPr>
-                    <w:pStyle w:val="Compact"/>
-                    <w:jc w:val="center"/>
-                  </w:pPr>
-                  <w:r>
-                    <w:t xml:space="preserve">0.132</w:t>
-                  </w:r>
-                </w:p>
-              </w:tc>
-              <w:tc>
-                <w:tcPr/>
-                <w:p>
-                  <w:pPr>
-                    <w:pStyle w:val="Compact"/>
-                    <w:jc w:val="center"/>
-                  </w:pPr>
-                  <w:r>
-                    <w:t xml:space="preserve">0.13</w:t>
-                  </w:r>
-                </w:p>
-              </w:tc>
-              <w:tc>
-                <w:tcPr/>
-                <w:p>
-                  <w:pPr>
-                    <w:pStyle w:val="Compact"/>
-                    <w:jc w:val="center"/>
-                  </w:pPr>
-                  <w:r>
-                    <w:t xml:space="preserve">2.3</w:t>
-                  </w:r>
-                </w:p>
-              </w:tc>
-            </w:tr>
-            <w:tr>
-              <w:tc>
-                <w:tcPr/>
-                <w:p>
-                  <w:pPr>
-                    <w:pStyle w:val="Compact"/>
-                    <w:jc w:val="center"/>
-                  </w:pPr>
-                  <w:r>
-                    <w:t xml:space="preserve">warfarin</w:t>
-                  </w:r>
-                </w:p>
-              </w:tc>
-              <w:tc>
-                <w:tcPr/>
-                <w:p>
-                  <w:pPr>
-                    <w:pStyle w:val="Compact"/>
-                    <w:jc w:val="center"/>
-                  </w:pPr>
-                  <m:oMath>
-                    <m:r>
-                      <m:t>V</m:t>
-                    </m:r>
-                  </m:oMath>
-                </w:p>
-              </w:tc>
-              <w:tc>
-                <w:tcPr/>
-                <w:p>
-                  <w:pPr>
-                    <w:pStyle w:val="Compact"/>
-                    <w:jc w:val="center"/>
-                  </w:pPr>
-                  <w:r>
-                    <w:t xml:space="preserve">7.94</w:t>
-                  </w:r>
-                </w:p>
-              </w:tc>
-              <w:tc>
-                <w:tcPr/>
-                <w:p>
-                  <w:pPr>
-                    <w:pStyle w:val="Compact"/>
-                    <w:jc w:val="center"/>
-                  </w:pPr>
-                  <w:r>
-                    <w:t xml:space="preserve">8.02</w:t>
-                  </w:r>
-                </w:p>
-              </w:tc>
-              <w:tc>
-                <w:tcPr/>
-                <w:p>
-                  <w:pPr>
-                    <w:pStyle w:val="Compact"/>
-                    <w:jc w:val="center"/>
-                  </w:pPr>
-                  <w:r>
-                    <w:t xml:space="preserve">-1.01</w:t>
-                  </w:r>
-                </w:p>
-              </w:tc>
-            </w:tr>
-            <w:tr>
-              <w:tc>
-                <w:tcPr/>
-                <w:p>
-                  <w:pPr>
-                    <w:pStyle w:val="Compact"/>
-                    <w:jc w:val="center"/>
-                  </w:pPr>
-                  <w:r>
-                    <w:t xml:space="preserve">warfarin</w:t>
-                  </w:r>
-                </w:p>
-              </w:tc>
-              <w:tc>
-                <w:tcPr/>
-                <w:p>
-                  <w:pPr>
-                    <w:pStyle w:val="Compact"/>
-                    <w:jc w:val="center"/>
-                  </w:pPr>
-                  <m:oMath>
-                    <m:sSub>
-                      <m:e>
-                        <m:r>
-                          <m:t>k</m:t>
-                        </m:r>
-                      </m:e>
-                      <m:sub>
-                        <m:r>
-                          <m:t>a</m:t>
-                        </m:r>
-                      </m:sub>
-                    </m:sSub>
-                  </m:oMath>
-                </w:p>
-              </w:tc>
-              <w:tc>
-                <w:tcPr/>
-                <w:p>
-                  <w:pPr>
-                    <w:pStyle w:val="Compact"/>
-                    <w:jc w:val="center"/>
-                  </w:pPr>
-                  <w:r>
-                    <w:t xml:space="preserve">0.617</w:t>
-                  </w:r>
-                </w:p>
-              </w:tc>
-              <w:tc>
-                <w:tcPr/>
-                <w:p>
-                  <w:pPr>
-                    <w:pStyle w:val="Compact"/>
-                    <w:jc w:val="center"/>
-                  </w:pPr>
-                  <w:r>
-                    <w:t xml:space="preserve">0.637</w:t>
-                  </w:r>
-                </w:p>
-              </w:tc>
-              <w:tc>
-                <w:tcPr/>
-                <w:p>
-                  <w:pPr>
-                    <w:pStyle w:val="Compact"/>
-                    <w:jc w:val="center"/>
-                  </w:pPr>
-                  <w:r>
-                    <w:t xml:space="preserve">-3.1</w:t>
-                  </w:r>
-                </w:p>
-              </w:tc>
-            </w:tr>
-            <w:tr>
-              <w:tc>
-                <w:tcPr/>
-                <w:p>
-                  <w:pPr>
-                    <w:pStyle w:val="Compact"/>
-                    <w:jc w:val="center"/>
-                  </w:pPr>
-                  <w:r>
-                    <w:t xml:space="preserve">warfarin</w:t>
-                  </w:r>
-                </w:p>
-              </w:tc>
-              <w:tc>
-                <w:tcPr/>
-                <w:p>
-                  <w:pPr>
-                    <w:pStyle w:val="Compact"/>
-                    <w:jc w:val="center"/>
-                  </w:pPr>
-                  <m:oMath>
-                    <m:sSub>
-                      <m:e>
-                        <m:r>
-                          <m:t>ω</m:t>
-                        </m:r>
-                      </m:e>
-                      <m:sub>
-                        <m:r>
-                          <m:t>C</m:t>
-                        </m:r>
-                        <m:r>
-                          <m:t>L</m:t>
-                        </m:r>
-                      </m:sub>
-                    </m:sSub>
-                  </m:oMath>
-                </w:p>
-              </w:tc>
-              <w:tc>
-                <w:tcPr/>
-                <w:p>
-                  <w:pPr>
-                    <w:pStyle w:val="Compact"/>
-                    <w:jc w:val="center"/>
-                  </w:pPr>
-                  <w:r>
-                    <w:t xml:space="preserve">0.278</w:t>
-                  </w:r>
-                </w:p>
-              </w:tc>
-              <w:tc>
-                <w:tcPr/>
-                <w:p>
-                  <w:pPr>
-                    <w:pStyle w:val="Compact"/>
-                    <w:jc w:val="center"/>
-                  </w:pPr>
-                  <w:r>
-                    <w:t xml:space="preserve">0.276</w:t>
-                  </w:r>
-                </w:p>
-              </w:tc>
-              <w:tc>
-                <w:tcPr/>
-                <w:p>
-                  <w:pPr>
-                    <w:pStyle w:val="Compact"/>
-                    <w:jc w:val="center"/>
-                  </w:pPr>
-                  <w:r>
-                    <w:t xml:space="preserve">0.772</w:t>
-                  </w:r>
-                </w:p>
-              </w:tc>
-            </w:tr>
-            <w:tr>
-              <w:tc>
-                <w:tcPr/>
-                <w:p>
-                  <w:pPr>
-                    <w:pStyle w:val="Compact"/>
-                    <w:jc w:val="center"/>
-                  </w:pPr>
-                  <w:r>
-                    <w:t xml:space="preserve">warfarin</w:t>
-                  </w:r>
-                </w:p>
-              </w:tc>
-              <w:tc>
-                <w:tcPr/>
-                <w:p>
-                  <w:pPr>
-                    <w:pStyle w:val="Compact"/>
-                    <w:jc w:val="center"/>
-                  </w:pPr>
-                  <m:oMath>
-                    <m:sSub>
-                      <m:e>
-                        <m:r>
-                          <m:t>ω</m:t>
-                        </m:r>
-                      </m:e>
-                      <m:sub>
-                        <m:r>
-                          <m:t>V</m:t>
-                        </m:r>
-                      </m:sub>
-                    </m:sSub>
-                  </m:oMath>
-                </w:p>
-              </w:tc>
-              <w:tc>
-                <w:tcPr/>
-                <w:p>
-                  <w:pPr>
-                    <w:pStyle w:val="Compact"/>
-                    <w:jc w:val="center"/>
-                  </w:pPr>
-                  <w:r>
-                    <w:t xml:space="preserve">0.19</w:t>
-                  </w:r>
-                </w:p>
-              </w:tc>
-              <w:tc>
-                <w:tcPr/>
-                <w:p>
-                  <w:pPr>
-                    <w:pStyle w:val="Compact"/>
-                    <w:jc w:val="center"/>
-                  </w:pPr>
-                  <w:r>
-                    <w:t xml:space="preserve">0.207</w:t>
-                  </w:r>
-                </w:p>
-              </w:tc>
-              <w:tc>
-                <w:tcPr/>
-                <w:p>
-                  <w:pPr>
-                    <w:pStyle w:val="Compact"/>
-                    <w:jc w:val="center"/>
-                  </w:pPr>
-                  <w:r>
-                    <w:t xml:space="preserve">-8.6</w:t>
-                  </w:r>
-                </w:p>
-              </w:tc>
-            </w:tr>
-            <w:tr>
-              <w:tc>
-                <w:tcPr/>
-                <w:p>
-                  <w:pPr>
-                    <w:pStyle w:val="Compact"/>
-                    <w:jc w:val="center"/>
-                  </w:pPr>
-                  <w:r>
-                    <w:t xml:space="preserve">warfarin</w:t>
-                  </w:r>
-                </w:p>
-              </w:tc>
-              <w:tc>
-                <w:tcPr/>
-                <w:p>
-                  <w:pPr>
-                    <w:pStyle w:val="Compact"/>
-                    <w:jc w:val="center"/>
-                  </w:pPr>
-                  <m:oMath>
-                    <m:sSub>
-                      <m:e>
-                        <m:r>
-                          <m:t>ω</m:t>
-                        </m:r>
-                      </m:e>
-                      <m:sub>
-                        <m:sSub>
-                          <m:e>
-                            <m:r>
-                              <m:t>k</m:t>
-                            </m:r>
-                          </m:e>
-                          <m:sub>
-                            <m:r>
-                              <m:t>a</m:t>
-                            </m:r>
-                          </m:sub>
-                        </m:sSub>
-                      </m:sub>
-                    </m:sSub>
-                  </m:oMath>
-                </w:p>
-              </w:tc>
-              <w:tc>
-                <w:tcPr/>
-                <w:p>
-                  <w:pPr>
-                    <w:pStyle w:val="Compact"/>
-                    <w:jc w:val="center"/>
-                  </w:pPr>
-                  <w:r>
-                    <w:t xml:space="preserve">0.811</w:t>
-                  </w:r>
-                </w:p>
-              </w:tc>
-              <w:tc>
-                <w:tcPr/>
-                <w:p>
-                  <w:pPr>
-                    <w:pStyle w:val="Compact"/>
-                    <w:jc w:val="center"/>
-                  </w:pPr>
-                  <w:r>
-                    <w:t xml:space="preserve">0.978</w:t>
-                  </w:r>
-                </w:p>
-              </w:tc>
-              <w:tc>
-                <w:tcPr/>
-                <w:p>
-                  <w:pPr>
-                    <w:pStyle w:val="Compact"/>
-                    <w:jc w:val="center"/>
-                  </w:pPr>
-                  <w:r>
-                    <w:t xml:space="preserve">-17</w:t>
-                  </w:r>
-                </w:p>
-              </w:tc>
-            </w:tr>
-            <w:tr>
-              <w:tc>
-                <w:tcPr/>
-                <w:p>
-                  <w:pPr>
-                    <w:pStyle w:val="Compact"/>
-                    <w:jc w:val="center"/>
-                  </w:pPr>
-                  <w:r>
-                    <w:t xml:space="preserve">warfarin</w:t>
-                  </w:r>
-                </w:p>
-              </w:tc>
-              <w:tc>
-                <w:tcPr/>
-                <w:p>
-                  <w:pPr>
-                    <w:pStyle w:val="Compact"/>
-                    <w:jc w:val="center"/>
-                  </w:pPr>
-                  <m:oMath>
-                    <m:r>
-                      <m:t>σ</m:t>
-                    </m:r>
-                  </m:oMath>
-                </w:p>
-              </w:tc>
-              <w:tc>
-                <w:tcPr/>
-                <w:p>
-                  <w:pPr>
-                    <w:pStyle w:val="Compact"/>
-                    <w:jc w:val="center"/>
-                  </w:pPr>
-                  <w:r>
-                    <w:t xml:space="preserve">0.207</w:t>
-                  </w:r>
-                </w:p>
-              </w:tc>
-              <w:tc>
-                <w:tcPr/>
-                <w:p>
-                  <w:pPr>
-                    <w:pStyle w:val="Compact"/>
-                    <w:jc w:val="center"/>
-                  </w:pPr>
-                  <w:r>
-                    <w:t xml:space="preserve">0.203</w:t>
-                  </w:r>
-                </w:p>
-              </w:tc>
-              <w:tc>
-                <w:tcPr/>
-                <w:p>
-                  <w:pPr>
-                    <w:pStyle w:val="Compact"/>
-                    <w:jc w:val="center"/>
-                  </w:pPr>
-                  <w:r>
-                    <w:t xml:space="preserve">2.11</w:t>
-                  </w:r>
-                </w:p>
-              </w:tc>
-            </w:tr>
-          </w:tbl>
           <w:p>
             <w:pPr>
               <w:jc w:val="center"/>
@@ -19312,32 +18217,6 @@
               <w:t xml:space="preserve">for the theophylline and warfarin datasets, with percent difference between the two estimates.</w:t>
             </w:r>
           </w:p>
-          <w:bookmarkEnd w:id="103"/>
-        </w:tc>
-      </w:tr>
-    </w:tbl>
-    <w:p>
-      <w:pPr>
-        <w:pStyle w:val="BodyText"/>
-      </w:pPr>
-      <w:r>
-        <w:t xml:space="preserve"> </w:t>
-      </w:r>
-    </w:p>
-    <w:tbl>
-      <w:tblPr>
-        <w:tblStyle w:val="Table"/>
-        <w:tblW w:type="pct" w:w="5000"/>
-        <w:tblLayout w:type="fixed"/>
-        <w:tblLook w:firstRow="0" w:lastRow="0" w:firstColumn="0" w:lastColumn="0" w:noHBand="0" w:noVBand="0" w:val="0000"/>
-      </w:tblPr>
-      <w:tblGrid>
-        <w:gridCol w:w="7920"/>
-      </w:tblGrid>
-      <w:tr>
-        <w:tc>
-          <w:tcPr/>
-          <w:bookmarkStart w:id="104" w:name="supptbl-psis-ess"/>
           <w:tbl>
             <w:tblPr>
               <w:tblStyle w:val="Table"/>
@@ -19363,55 +18242,77 @@
                     <w:jc w:val="center"/>
                   </w:pPr>
                   <w:r>
-                    <w:t xml:space="preserve">Fit-quality arm</w:t>
-                  </w:r>
-                </w:p>
-              </w:tc>
-              <w:tc>
-                <w:tcPr/>
-                <w:p>
-                  <w:pPr>
-                    <w:pStyle w:val="Compact"/>
-                    <w:jc w:val="center"/>
-                  </w:pPr>
-                  <w:r>
-                    <w:t xml:space="preserve">Mean</w:t>
-                  </w:r>
-                </w:p>
-              </w:tc>
-              <w:tc>
-                <w:tcPr/>
-                <w:p>
-                  <w:pPr>
-                    <w:pStyle w:val="Compact"/>
-                    <w:jc w:val="center"/>
-                  </w:pPr>
-                  <w:r>
-                    <w:t xml:space="preserve">Median</w:t>
-                  </w:r>
-                </w:p>
-              </w:tc>
-              <w:tc>
-                <w:tcPr/>
-                <w:p>
-                  <w:pPr>
-                    <w:pStyle w:val="Compact"/>
-                    <w:jc w:val="center"/>
-                  </w:pPr>
-                  <w:r>
-                    <w:t xml:space="preserve">Minimum</w:t>
-                  </w:r>
-                </w:p>
-              </w:tc>
-              <w:tc>
-                <w:tcPr/>
-                <w:p>
-                  <w:pPr>
-                    <w:pStyle w:val="Compact"/>
-                    <w:jc w:val="center"/>
-                  </w:pPr>
-                  <w:r>
-                    <w:t xml:space="preserve">Maximum</w:t>
+                    <w:t xml:space="preserve">Dataset</w:t>
+                  </w:r>
+                </w:p>
+              </w:tc>
+              <w:tc>
+                <w:tcPr/>
+                <w:p>
+                  <w:pPr>
+                    <w:pStyle w:val="Compact"/>
+                    <w:jc w:val="center"/>
+                  </w:pPr>
+                  <w:r>
+                    <w:t xml:space="preserve">Parameter</w:t>
+                  </w:r>
+                </w:p>
+              </w:tc>
+              <w:tc>
+                <w:tcPr/>
+                <w:p>
+                  <w:pPr>
+                    <w:pStyle w:val="Compact"/>
+                    <w:jc w:val="center"/>
+                  </w:pPr>
+                  <m:oMath>
+                    <m:r>
+                      <m:t>K</m:t>
+                    </m:r>
+                    <m:r>
+                      <m:rPr>
+                        <m:sty m:val="p"/>
+                      </m:rPr>
+                      <m:t>=</m:t>
+                    </m:r>
+                    <m:r>
+                      <m:t>1</m:t>
+                    </m:r>
+                  </m:oMath>
+                </w:p>
+              </w:tc>
+              <w:tc>
+                <w:tcPr/>
+                <w:p>
+                  <w:pPr>
+                    <w:pStyle w:val="Compact"/>
+                    <w:jc w:val="center"/>
+                  </w:pPr>
+                  <m:oMath>
+                    <m:r>
+                      <m:t>K</m:t>
+                    </m:r>
+                    <m:r>
+                      <m:rPr>
+                        <m:sty m:val="p"/>
+                      </m:rPr>
+                      <m:t>=</m:t>
+                    </m:r>
+                    <m:r>
+                      <m:t>64</m:t>
+                    </m:r>
+                  </m:oMath>
+                </w:p>
+              </w:tc>
+              <w:tc>
+                <w:tcPr/>
+                <w:p>
+                  <w:pPr>
+                    <w:pStyle w:val="Compact"/>
+                    <w:jc w:val="center"/>
+                  </w:pPr>
+                  <w:r>
+                    <w:t xml:space="preserve">Difference (%)</w:t>
                   </w:r>
                 </w:p>
               </w:tc>
@@ -19425,55 +18326,60 @@
                     <w:jc w:val="center"/>
                   </w:pPr>
                   <w:r>
-                    <w:t xml:space="preserve">bad</w:t>
-                  </w:r>
-                </w:p>
-              </w:tc>
-              <w:tc>
-                <w:tcPr/>
-                <w:p>
-                  <w:pPr>
-                    <w:pStyle w:val="Compact"/>
-                    <w:jc w:val="center"/>
-                  </w:pPr>
-                  <w:r>
-                    <w:t xml:space="preserve">1200</w:t>
-                  </w:r>
-                </w:p>
-              </w:tc>
-              <w:tc>
-                <w:tcPr/>
-                <w:p>
-                  <w:pPr>
-                    <w:pStyle w:val="Compact"/>
-                    <w:jc w:val="center"/>
-                  </w:pPr>
-                  <w:r>
-                    <w:t xml:space="preserve">1180</w:t>
-                  </w:r>
-                </w:p>
-              </w:tc>
-              <w:tc>
-                <w:tcPr/>
-                <w:p>
-                  <w:pPr>
-                    <w:pStyle w:val="Compact"/>
-                    <w:jc w:val="center"/>
-                  </w:pPr>
-                  <w:r>
-                    <w:t xml:space="preserve">175</w:t>
-                  </w:r>
-                </w:p>
-              </w:tc>
-              <w:tc>
-                <w:tcPr/>
-                <w:p>
-                  <w:pPr>
-                    <w:pStyle w:val="Compact"/>
-                    <w:jc w:val="center"/>
-                  </w:pPr>
-                  <w:r>
-                    <w:t xml:space="preserve">2850</w:t>
+                    <w:t xml:space="preserve">theophylline</w:t>
+                  </w:r>
+                </w:p>
+              </w:tc>
+              <w:tc>
+                <w:tcPr/>
+                <w:p>
+                  <w:pPr>
+                    <w:pStyle w:val="Compact"/>
+                    <w:jc w:val="center"/>
+                  </w:pPr>
+                  <m:oMath>
+                    <m:r>
+                      <m:t>C</m:t>
+                    </m:r>
+                    <m:r>
+                      <m:t>L</m:t>
+                    </m:r>
+                  </m:oMath>
+                </w:p>
+              </w:tc>
+              <w:tc>
+                <w:tcPr/>
+                <w:p>
+                  <w:pPr>
+                    <w:pStyle w:val="Compact"/>
+                    <w:jc w:val="center"/>
+                  </w:pPr>
+                  <w:r>
+                    <w:t xml:space="preserve">0.04</w:t>
+                  </w:r>
+                </w:p>
+              </w:tc>
+              <w:tc>
+                <w:tcPr/>
+                <w:p>
+                  <w:pPr>
+                    <w:pStyle w:val="Compact"/>
+                    <w:jc w:val="center"/>
+                  </w:pPr>
+                  <w:r>
+                    <w:t xml:space="preserve">0.0403</w:t>
+                  </w:r>
+                </w:p>
+              </w:tc>
+              <w:tc>
+                <w:tcPr/>
+                <w:p>
+                  <w:pPr>
+                    <w:pStyle w:val="Compact"/>
+                    <w:jc w:val="center"/>
+                  </w:pPr>
+                  <w:r>
+                    <w:t xml:space="preserve">-0.882</w:t>
                   </w:r>
                 </w:p>
               </w:tc>
@@ -19487,60 +18393,956 @@
                     <w:jc w:val="center"/>
                   </w:pPr>
                   <w:r>
-                    <w:t xml:space="preserve">good</w:t>
-                  </w:r>
-                </w:p>
-              </w:tc>
-              <w:tc>
-                <w:tcPr/>
-                <w:p>
-                  <w:pPr>
-                    <w:pStyle w:val="Compact"/>
-                    <w:jc w:val="center"/>
-                  </w:pPr>
-                  <w:r>
-                    <w:t xml:space="preserve">1790</w:t>
-                  </w:r>
-                </w:p>
-              </w:tc>
-              <w:tc>
-                <w:tcPr/>
-                <w:p>
-                  <w:pPr>
-                    <w:pStyle w:val="Compact"/>
-                    <w:jc w:val="center"/>
-                  </w:pPr>
-                  <w:r>
-                    <w:t xml:space="preserve">1790</w:t>
-                  </w:r>
-                </w:p>
-              </w:tc>
-              <w:tc>
-                <w:tcPr/>
-                <w:p>
-                  <w:pPr>
-                    <w:pStyle w:val="Compact"/>
-                    <w:jc w:val="center"/>
-                  </w:pPr>
-                  <w:r>
-                    <w:t xml:space="preserve">10.7</w:t>
-                  </w:r>
-                </w:p>
-              </w:tc>
-              <w:tc>
-                <w:tcPr/>
-                <w:p>
-                  <w:pPr>
-                    <w:pStyle w:val="Compact"/>
-                    <w:jc w:val="center"/>
-                  </w:pPr>
-                  <w:r>
-                    <w:t xml:space="preserve">3220</w:t>
+                    <w:t xml:space="preserve">theophylline</w:t>
+                  </w:r>
+                </w:p>
+              </w:tc>
+              <w:tc>
+                <w:tcPr/>
+                <w:p>
+                  <w:pPr>
+                    <w:pStyle w:val="Compact"/>
+                    <w:jc w:val="center"/>
+                  </w:pPr>
+                  <m:oMath>
+                    <m:r>
+                      <m:t>V</m:t>
+                    </m:r>
+                  </m:oMath>
+                </w:p>
+              </w:tc>
+              <w:tc>
+                <w:tcPr/>
+                <w:p>
+                  <w:pPr>
+                    <w:pStyle w:val="Compact"/>
+                    <w:jc w:val="center"/>
+                  </w:pPr>
+                  <w:r>
+                    <w:t xml:space="preserve">0.462</w:t>
+                  </w:r>
+                </w:p>
+              </w:tc>
+              <w:tc>
+                <w:tcPr/>
+                <w:p>
+                  <w:pPr>
+                    <w:pStyle w:val="Compact"/>
+                    <w:jc w:val="center"/>
+                  </w:pPr>
+                  <w:r>
+                    <w:t xml:space="preserve">0.452</w:t>
+                  </w:r>
+                </w:p>
+              </w:tc>
+              <w:tc>
+                <w:tcPr/>
+                <w:p>
+                  <w:pPr>
+                    <w:pStyle w:val="Compact"/>
+                    <w:jc w:val="center"/>
+                  </w:pPr>
+                  <w:r>
+                    <w:t xml:space="preserve">2.35</w:t>
+                  </w:r>
+                </w:p>
+              </w:tc>
+            </w:tr>
+            <w:tr>
+              <w:tc>
+                <w:tcPr/>
+                <w:p>
+                  <w:pPr>
+                    <w:pStyle w:val="Compact"/>
+                    <w:jc w:val="center"/>
+                  </w:pPr>
+                  <w:r>
+                    <w:t xml:space="preserve">theophylline</w:t>
+                  </w:r>
+                </w:p>
+              </w:tc>
+              <w:tc>
+                <w:tcPr/>
+                <w:p>
+                  <w:pPr>
+                    <w:pStyle w:val="Compact"/>
+                    <w:jc w:val="center"/>
+                  </w:pPr>
+                  <m:oMath>
+                    <m:sSub>
+                      <m:e>
+                        <m:r>
+                          <m:t>k</m:t>
+                        </m:r>
+                      </m:e>
+                      <m:sub>
+                        <m:r>
+                          <m:t>a</m:t>
+                        </m:r>
+                      </m:sub>
+                    </m:sSub>
+                  </m:oMath>
+                </w:p>
+              </w:tc>
+              <w:tc>
+                <w:tcPr/>
+                <w:p>
+                  <w:pPr>
+                    <w:pStyle w:val="Compact"/>
+                    <w:jc w:val="center"/>
+                  </w:pPr>
+                  <w:r>
+                    <w:t xml:space="preserve">1.29</w:t>
+                  </w:r>
+                </w:p>
+              </w:tc>
+              <w:tc>
+                <w:tcPr/>
+                <w:p>
+                  <w:pPr>
+                    <w:pStyle w:val="Compact"/>
+                    <w:jc w:val="center"/>
+                  </w:pPr>
+                  <w:r>
+                    <w:t xml:space="preserve">1.34</w:t>
+                  </w:r>
+                </w:p>
+              </w:tc>
+              <w:tc>
+                <w:tcPr/>
+                <w:p>
+                  <w:pPr>
+                    <w:pStyle w:val="Compact"/>
+                    <w:jc w:val="center"/>
+                  </w:pPr>
+                  <w:r>
+                    <w:t xml:space="preserve">-4.27</w:t>
+                  </w:r>
+                </w:p>
+              </w:tc>
+            </w:tr>
+            <w:tr>
+              <w:tc>
+                <w:tcPr/>
+                <w:p>
+                  <w:pPr>
+                    <w:pStyle w:val="Compact"/>
+                    <w:jc w:val="center"/>
+                  </w:pPr>
+                  <w:r>
+                    <w:t xml:space="preserve">theophylline</w:t>
+                  </w:r>
+                </w:p>
+              </w:tc>
+              <w:tc>
+                <w:tcPr/>
+                <w:p>
+                  <w:pPr>
+                    <w:pStyle w:val="Compact"/>
+                    <w:jc w:val="center"/>
+                  </w:pPr>
+                  <m:oMath>
+                    <m:sSub>
+                      <m:e>
+                        <m:r>
+                          <m:t>ω</m:t>
+                        </m:r>
+                      </m:e>
+                      <m:sub>
+                        <m:r>
+                          <m:t>C</m:t>
+                        </m:r>
+                        <m:r>
+                          <m:t>L</m:t>
+                        </m:r>
+                      </m:sub>
+                    </m:sSub>
+                  </m:oMath>
+                </w:p>
+              </w:tc>
+              <w:tc>
+                <w:tcPr/>
+                <w:p>
+                  <w:pPr>
+                    <w:pStyle w:val="Compact"/>
+                    <w:jc w:val="center"/>
+                  </w:pPr>
+                  <w:r>
+                    <w:t xml:space="preserve">0.245</w:t>
+                  </w:r>
+                </w:p>
+              </w:tc>
+              <w:tc>
+                <w:tcPr/>
+                <w:p>
+                  <w:pPr>
+                    <w:pStyle w:val="Compact"/>
+                    <w:jc w:val="center"/>
+                  </w:pPr>
+                  <w:r>
+                    <w:t xml:space="preserve">0.255</w:t>
+                  </w:r>
+                </w:p>
+              </w:tc>
+              <w:tc>
+                <w:tcPr/>
+                <w:p>
+                  <w:pPr>
+                    <w:pStyle w:val="Compact"/>
+                    <w:jc w:val="center"/>
+                  </w:pPr>
+                  <w:r>
+                    <w:t xml:space="preserve">-3.81</w:t>
+                  </w:r>
+                </w:p>
+              </w:tc>
+            </w:tr>
+            <w:tr>
+              <w:tc>
+                <w:tcPr/>
+                <w:p>
+                  <w:pPr>
+                    <w:pStyle w:val="Compact"/>
+                    <w:jc w:val="center"/>
+                  </w:pPr>
+                  <w:r>
+                    <w:t xml:space="preserve">theophylline</w:t>
+                  </w:r>
+                </w:p>
+              </w:tc>
+              <w:tc>
+                <w:tcPr/>
+                <w:p>
+                  <w:pPr>
+                    <w:pStyle w:val="Compact"/>
+                    <w:jc w:val="center"/>
+                  </w:pPr>
+                  <m:oMath>
+                    <m:sSub>
+                      <m:e>
+                        <m:r>
+                          <m:t>ω</m:t>
+                        </m:r>
+                      </m:e>
+                      <m:sub>
+                        <m:r>
+                          <m:t>V</m:t>
+                        </m:r>
+                      </m:sub>
+                    </m:sSub>
+                  </m:oMath>
+                </w:p>
+              </w:tc>
+              <w:tc>
+                <w:tcPr/>
+                <w:p>
+                  <w:pPr>
+                    <w:pStyle w:val="Compact"/>
+                    <w:jc w:val="center"/>
+                  </w:pPr>
+                  <w:r>
+                    <w:t xml:space="preserve">0.0921</w:t>
+                  </w:r>
+                </w:p>
+              </w:tc>
+              <w:tc>
+                <w:tcPr/>
+                <w:p>
+                  <w:pPr>
+                    <w:pStyle w:val="Compact"/>
+                    <w:jc w:val="center"/>
+                  </w:pPr>
+                  <w:r>
+                    <w:t xml:space="preserve">0.113</w:t>
+                  </w:r>
+                </w:p>
+              </w:tc>
+              <w:tc>
+                <w:tcPr/>
+                <w:p>
+                  <w:pPr>
+                    <w:pStyle w:val="Compact"/>
+                    <w:jc w:val="center"/>
+                  </w:pPr>
+                  <w:r>
+                    <w:t xml:space="preserve">-18.2</w:t>
+                  </w:r>
+                </w:p>
+              </w:tc>
+            </w:tr>
+            <w:tr>
+              <w:tc>
+                <w:tcPr/>
+                <w:p>
+                  <w:pPr>
+                    <w:pStyle w:val="Compact"/>
+                    <w:jc w:val="center"/>
+                  </w:pPr>
+                  <w:r>
+                    <w:t xml:space="preserve">theophylline</w:t>
+                  </w:r>
+                </w:p>
+              </w:tc>
+              <w:tc>
+                <w:tcPr/>
+                <w:p>
+                  <w:pPr>
+                    <w:pStyle w:val="Compact"/>
+                    <w:jc w:val="center"/>
+                  </w:pPr>
+                  <m:oMath>
+                    <m:sSub>
+                      <m:e>
+                        <m:r>
+                          <m:t>ω</m:t>
+                        </m:r>
+                      </m:e>
+                      <m:sub>
+                        <m:sSub>
+                          <m:e>
+                            <m:r>
+                              <m:t>k</m:t>
+                            </m:r>
+                          </m:e>
+                          <m:sub>
+                            <m:r>
+                              <m:t>a</m:t>
+                            </m:r>
+                          </m:sub>
+                        </m:sSub>
+                      </m:sub>
+                    </m:sSub>
+                  </m:oMath>
+                </w:p>
+              </w:tc>
+              <w:tc>
+                <w:tcPr/>
+                <w:p>
+                  <w:pPr>
+                    <w:pStyle w:val="Compact"/>
+                    <w:jc w:val="center"/>
+                  </w:pPr>
+                  <w:r>
+                    <w:t xml:space="preserve">0.646</w:t>
+                  </w:r>
+                </w:p>
+              </w:tc>
+              <w:tc>
+                <w:tcPr/>
+                <w:p>
+                  <w:pPr>
+                    <w:pStyle w:val="Compact"/>
+                    <w:jc w:val="center"/>
+                  </w:pPr>
+                  <w:r>
+                    <w:t xml:space="preserve">0.682</w:t>
+                  </w:r>
+                </w:p>
+              </w:tc>
+              <w:tc>
+                <w:tcPr/>
+                <w:p>
+                  <w:pPr>
+                    <w:pStyle w:val="Compact"/>
+                    <w:jc w:val="center"/>
+                  </w:pPr>
+                  <w:r>
+                    <w:t xml:space="preserve">-5.22</w:t>
+                  </w:r>
+                </w:p>
+              </w:tc>
+            </w:tr>
+            <w:tr>
+              <w:tc>
+                <w:tcPr/>
+                <w:p>
+                  <w:pPr>
+                    <w:pStyle w:val="Compact"/>
+                    <w:jc w:val="center"/>
+                  </w:pPr>
+                  <w:r>
+                    <w:t xml:space="preserve">theophylline</w:t>
+                  </w:r>
+                </w:p>
+              </w:tc>
+              <w:tc>
+                <w:tcPr/>
+                <w:p>
+                  <w:pPr>
+                    <w:pStyle w:val="Compact"/>
+                    <w:jc w:val="center"/>
+                  </w:pPr>
+                  <m:oMath>
+                    <m:r>
+                      <m:t>σ</m:t>
+                    </m:r>
+                  </m:oMath>
+                </w:p>
+              </w:tc>
+              <w:tc>
+                <w:tcPr/>
+                <w:p>
+                  <w:pPr>
+                    <w:pStyle w:val="Compact"/>
+                    <w:jc w:val="center"/>
+                  </w:pPr>
+                  <w:r>
+                    <w:t xml:space="preserve">0.18</w:t>
+                  </w:r>
+                </w:p>
+              </w:tc>
+              <w:tc>
+                <w:tcPr/>
+                <w:p>
+                  <w:pPr>
+                    <w:pStyle w:val="Compact"/>
+                    <w:jc w:val="center"/>
+                  </w:pPr>
+                  <w:r>
+                    <w:t xml:space="preserve">0.172</w:t>
+                  </w:r>
+                </w:p>
+              </w:tc>
+              <w:tc>
+                <w:tcPr/>
+                <w:p>
+                  <w:pPr>
+                    <w:pStyle w:val="Compact"/>
+                    <w:jc w:val="center"/>
+                  </w:pPr>
+                  <w:r>
+                    <w:t xml:space="preserve">4.82</w:t>
+                  </w:r>
+                </w:p>
+              </w:tc>
+            </w:tr>
+            <w:tr>
+              <w:tc>
+                <w:tcPr/>
+                <w:p>
+                  <w:pPr>
+                    <w:pStyle w:val="Compact"/>
+                    <w:jc w:val="center"/>
+                  </w:pPr>
+                  <w:r>
+                    <w:t xml:space="preserve">warfarin</w:t>
+                  </w:r>
+                </w:p>
+              </w:tc>
+              <w:tc>
+                <w:tcPr/>
+                <w:p>
+                  <w:pPr>
+                    <w:pStyle w:val="Compact"/>
+                    <w:jc w:val="center"/>
+                  </w:pPr>
+                  <m:oMath>
+                    <m:r>
+                      <m:t>C</m:t>
+                    </m:r>
+                    <m:r>
+                      <m:t>L</m:t>
+                    </m:r>
+                  </m:oMath>
+                </w:p>
+              </w:tc>
+              <w:tc>
+                <w:tcPr/>
+                <w:p>
+                  <w:pPr>
+                    <w:pStyle w:val="Compact"/>
+                    <w:jc w:val="center"/>
+                  </w:pPr>
+                  <w:r>
+                    <w:t xml:space="preserve">0.132</w:t>
+                  </w:r>
+                </w:p>
+              </w:tc>
+              <w:tc>
+                <w:tcPr/>
+                <w:p>
+                  <w:pPr>
+                    <w:pStyle w:val="Compact"/>
+                    <w:jc w:val="center"/>
+                  </w:pPr>
+                  <w:r>
+                    <w:t xml:space="preserve">0.13</w:t>
+                  </w:r>
+                </w:p>
+              </w:tc>
+              <w:tc>
+                <w:tcPr/>
+                <w:p>
+                  <w:pPr>
+                    <w:pStyle w:val="Compact"/>
+                    <w:jc w:val="center"/>
+                  </w:pPr>
+                  <w:r>
+                    <w:t xml:space="preserve">2.3</w:t>
+                  </w:r>
+                </w:p>
+              </w:tc>
+            </w:tr>
+            <w:tr>
+              <w:tc>
+                <w:tcPr/>
+                <w:p>
+                  <w:pPr>
+                    <w:pStyle w:val="Compact"/>
+                    <w:jc w:val="center"/>
+                  </w:pPr>
+                  <w:r>
+                    <w:t xml:space="preserve">warfarin</w:t>
+                  </w:r>
+                </w:p>
+              </w:tc>
+              <w:tc>
+                <w:tcPr/>
+                <w:p>
+                  <w:pPr>
+                    <w:pStyle w:val="Compact"/>
+                    <w:jc w:val="center"/>
+                  </w:pPr>
+                  <m:oMath>
+                    <m:r>
+                      <m:t>V</m:t>
+                    </m:r>
+                  </m:oMath>
+                </w:p>
+              </w:tc>
+              <w:tc>
+                <w:tcPr/>
+                <w:p>
+                  <w:pPr>
+                    <w:pStyle w:val="Compact"/>
+                    <w:jc w:val="center"/>
+                  </w:pPr>
+                  <w:r>
+                    <w:t xml:space="preserve">7.94</w:t>
+                  </w:r>
+                </w:p>
+              </w:tc>
+              <w:tc>
+                <w:tcPr/>
+                <w:p>
+                  <w:pPr>
+                    <w:pStyle w:val="Compact"/>
+                    <w:jc w:val="center"/>
+                  </w:pPr>
+                  <w:r>
+                    <w:t xml:space="preserve">8.02</w:t>
+                  </w:r>
+                </w:p>
+              </w:tc>
+              <w:tc>
+                <w:tcPr/>
+                <w:p>
+                  <w:pPr>
+                    <w:pStyle w:val="Compact"/>
+                    <w:jc w:val="center"/>
+                  </w:pPr>
+                  <w:r>
+                    <w:t xml:space="preserve">-1.01</w:t>
+                  </w:r>
+                </w:p>
+              </w:tc>
+            </w:tr>
+            <w:tr>
+              <w:tc>
+                <w:tcPr/>
+                <w:p>
+                  <w:pPr>
+                    <w:pStyle w:val="Compact"/>
+                    <w:jc w:val="center"/>
+                  </w:pPr>
+                  <w:r>
+                    <w:t xml:space="preserve">warfarin</w:t>
+                  </w:r>
+                </w:p>
+              </w:tc>
+              <w:tc>
+                <w:tcPr/>
+                <w:p>
+                  <w:pPr>
+                    <w:pStyle w:val="Compact"/>
+                    <w:jc w:val="center"/>
+                  </w:pPr>
+                  <m:oMath>
+                    <m:sSub>
+                      <m:e>
+                        <m:r>
+                          <m:t>k</m:t>
+                        </m:r>
+                      </m:e>
+                      <m:sub>
+                        <m:r>
+                          <m:t>a</m:t>
+                        </m:r>
+                      </m:sub>
+                    </m:sSub>
+                  </m:oMath>
+                </w:p>
+              </w:tc>
+              <w:tc>
+                <w:tcPr/>
+                <w:p>
+                  <w:pPr>
+                    <w:pStyle w:val="Compact"/>
+                    <w:jc w:val="center"/>
+                  </w:pPr>
+                  <w:r>
+                    <w:t xml:space="preserve">0.617</w:t>
+                  </w:r>
+                </w:p>
+              </w:tc>
+              <w:tc>
+                <w:tcPr/>
+                <w:p>
+                  <w:pPr>
+                    <w:pStyle w:val="Compact"/>
+                    <w:jc w:val="center"/>
+                  </w:pPr>
+                  <w:r>
+                    <w:t xml:space="preserve">0.637</w:t>
+                  </w:r>
+                </w:p>
+              </w:tc>
+              <w:tc>
+                <w:tcPr/>
+                <w:p>
+                  <w:pPr>
+                    <w:pStyle w:val="Compact"/>
+                    <w:jc w:val="center"/>
+                  </w:pPr>
+                  <w:r>
+                    <w:t xml:space="preserve">-3.1</w:t>
+                  </w:r>
+                </w:p>
+              </w:tc>
+            </w:tr>
+            <w:tr>
+              <w:tc>
+                <w:tcPr/>
+                <w:p>
+                  <w:pPr>
+                    <w:pStyle w:val="Compact"/>
+                    <w:jc w:val="center"/>
+                  </w:pPr>
+                  <w:r>
+                    <w:t xml:space="preserve">warfarin</w:t>
+                  </w:r>
+                </w:p>
+              </w:tc>
+              <w:tc>
+                <w:tcPr/>
+                <w:p>
+                  <w:pPr>
+                    <w:pStyle w:val="Compact"/>
+                    <w:jc w:val="center"/>
+                  </w:pPr>
+                  <m:oMath>
+                    <m:sSub>
+                      <m:e>
+                        <m:r>
+                          <m:t>ω</m:t>
+                        </m:r>
+                      </m:e>
+                      <m:sub>
+                        <m:r>
+                          <m:t>C</m:t>
+                        </m:r>
+                        <m:r>
+                          <m:t>L</m:t>
+                        </m:r>
+                      </m:sub>
+                    </m:sSub>
+                  </m:oMath>
+                </w:p>
+              </w:tc>
+              <w:tc>
+                <w:tcPr/>
+                <w:p>
+                  <w:pPr>
+                    <w:pStyle w:val="Compact"/>
+                    <w:jc w:val="center"/>
+                  </w:pPr>
+                  <w:r>
+                    <w:t xml:space="preserve">0.278</w:t>
+                  </w:r>
+                </w:p>
+              </w:tc>
+              <w:tc>
+                <w:tcPr/>
+                <w:p>
+                  <w:pPr>
+                    <w:pStyle w:val="Compact"/>
+                    <w:jc w:val="center"/>
+                  </w:pPr>
+                  <w:r>
+                    <w:t xml:space="preserve">0.276</w:t>
+                  </w:r>
+                </w:p>
+              </w:tc>
+              <w:tc>
+                <w:tcPr/>
+                <w:p>
+                  <w:pPr>
+                    <w:pStyle w:val="Compact"/>
+                    <w:jc w:val="center"/>
+                  </w:pPr>
+                  <w:r>
+                    <w:t xml:space="preserve">0.772</w:t>
+                  </w:r>
+                </w:p>
+              </w:tc>
+            </w:tr>
+            <w:tr>
+              <w:tc>
+                <w:tcPr/>
+                <w:p>
+                  <w:pPr>
+                    <w:pStyle w:val="Compact"/>
+                    <w:jc w:val="center"/>
+                  </w:pPr>
+                  <w:r>
+                    <w:t xml:space="preserve">warfarin</w:t>
+                  </w:r>
+                </w:p>
+              </w:tc>
+              <w:tc>
+                <w:tcPr/>
+                <w:p>
+                  <w:pPr>
+                    <w:pStyle w:val="Compact"/>
+                    <w:jc w:val="center"/>
+                  </w:pPr>
+                  <m:oMath>
+                    <m:sSub>
+                      <m:e>
+                        <m:r>
+                          <m:t>ω</m:t>
+                        </m:r>
+                      </m:e>
+                      <m:sub>
+                        <m:r>
+                          <m:t>V</m:t>
+                        </m:r>
+                      </m:sub>
+                    </m:sSub>
+                  </m:oMath>
+                </w:p>
+              </w:tc>
+              <w:tc>
+                <w:tcPr/>
+                <w:p>
+                  <w:pPr>
+                    <w:pStyle w:val="Compact"/>
+                    <w:jc w:val="center"/>
+                  </w:pPr>
+                  <w:r>
+                    <w:t xml:space="preserve">0.19</w:t>
+                  </w:r>
+                </w:p>
+              </w:tc>
+              <w:tc>
+                <w:tcPr/>
+                <w:p>
+                  <w:pPr>
+                    <w:pStyle w:val="Compact"/>
+                    <w:jc w:val="center"/>
+                  </w:pPr>
+                  <w:r>
+                    <w:t xml:space="preserve">0.207</w:t>
+                  </w:r>
+                </w:p>
+              </w:tc>
+              <w:tc>
+                <w:tcPr/>
+                <w:p>
+                  <w:pPr>
+                    <w:pStyle w:val="Compact"/>
+                    <w:jc w:val="center"/>
+                  </w:pPr>
+                  <w:r>
+                    <w:t xml:space="preserve">-8.6</w:t>
+                  </w:r>
+                </w:p>
+              </w:tc>
+            </w:tr>
+            <w:tr>
+              <w:tc>
+                <w:tcPr/>
+                <w:p>
+                  <w:pPr>
+                    <w:pStyle w:val="Compact"/>
+                    <w:jc w:val="center"/>
+                  </w:pPr>
+                  <w:r>
+                    <w:t xml:space="preserve">warfarin</w:t>
+                  </w:r>
+                </w:p>
+              </w:tc>
+              <w:tc>
+                <w:tcPr/>
+                <w:p>
+                  <w:pPr>
+                    <w:pStyle w:val="Compact"/>
+                    <w:jc w:val="center"/>
+                  </w:pPr>
+                  <m:oMath>
+                    <m:sSub>
+                      <m:e>
+                        <m:r>
+                          <m:t>ω</m:t>
+                        </m:r>
+                      </m:e>
+                      <m:sub>
+                        <m:sSub>
+                          <m:e>
+                            <m:r>
+                              <m:t>k</m:t>
+                            </m:r>
+                          </m:e>
+                          <m:sub>
+                            <m:r>
+                              <m:t>a</m:t>
+                            </m:r>
+                          </m:sub>
+                        </m:sSub>
+                      </m:sub>
+                    </m:sSub>
+                  </m:oMath>
+                </w:p>
+              </w:tc>
+              <w:tc>
+                <w:tcPr/>
+                <w:p>
+                  <w:pPr>
+                    <w:pStyle w:val="Compact"/>
+                    <w:jc w:val="center"/>
+                  </w:pPr>
+                  <w:r>
+                    <w:t xml:space="preserve">0.811</w:t>
+                  </w:r>
+                </w:p>
+              </w:tc>
+              <w:tc>
+                <w:tcPr/>
+                <w:p>
+                  <w:pPr>
+                    <w:pStyle w:val="Compact"/>
+                    <w:jc w:val="center"/>
+                  </w:pPr>
+                  <w:r>
+                    <w:t xml:space="preserve">0.978</w:t>
+                  </w:r>
+                </w:p>
+              </w:tc>
+              <w:tc>
+                <w:tcPr/>
+                <w:p>
+                  <w:pPr>
+                    <w:pStyle w:val="Compact"/>
+                    <w:jc w:val="center"/>
+                  </w:pPr>
+                  <w:r>
+                    <w:t xml:space="preserve">-17</w:t>
+                  </w:r>
+                </w:p>
+              </w:tc>
+            </w:tr>
+            <w:tr>
+              <w:tc>
+                <w:tcPr/>
+                <w:p>
+                  <w:pPr>
+                    <w:pStyle w:val="Compact"/>
+                    <w:jc w:val="center"/>
+                  </w:pPr>
+                  <w:r>
+                    <w:t xml:space="preserve">warfarin</w:t>
+                  </w:r>
+                </w:p>
+              </w:tc>
+              <w:tc>
+                <w:tcPr/>
+                <w:p>
+                  <w:pPr>
+                    <w:pStyle w:val="Compact"/>
+                    <w:jc w:val="center"/>
+                  </w:pPr>
+                  <m:oMath>
+                    <m:r>
+                      <m:t>σ</m:t>
+                    </m:r>
+                  </m:oMath>
+                </w:p>
+              </w:tc>
+              <w:tc>
+                <w:tcPr/>
+                <w:p>
+                  <w:pPr>
+                    <w:pStyle w:val="Compact"/>
+                    <w:jc w:val="center"/>
+                  </w:pPr>
+                  <w:r>
+                    <w:t xml:space="preserve">0.207</w:t>
+                  </w:r>
+                </w:p>
+              </w:tc>
+              <w:tc>
+                <w:tcPr/>
+                <w:p>
+                  <w:pPr>
+                    <w:pStyle w:val="Compact"/>
+                    <w:jc w:val="center"/>
+                  </w:pPr>
+                  <w:r>
+                    <w:t xml:space="preserve">0.203</w:t>
+                  </w:r>
+                </w:p>
+              </w:tc>
+              <w:tc>
+                <w:tcPr/>
+                <w:p>
+                  <w:pPr>
+                    <w:pStyle w:val="Compact"/>
+                    <w:jc w:val="center"/>
+                  </w:pPr>
+                  <w:r>
+                    <w:t xml:space="preserve">2.11</w:t>
                   </w:r>
                 </w:p>
               </w:tc>
             </w:tr>
           </w:tbl>
+          <w:bookmarkEnd w:id="103"/>
+          <w:p/>
+        </w:tc>
+      </w:tr>
+    </w:tbl>
+    <w:p>
+      <w:pPr>
+        <w:pStyle w:val="BodyText"/>
+      </w:pPr>
+      <w:r>
+        <w:t xml:space="preserve"> </w:t>
+      </w:r>
+    </w:p>
+    <w:tbl>
+      <w:tblPr>
+        <w:tblStyle w:val="Table"/>
+        <w:tblW w:type="pct" w:w="5000"/>
+        <w:tblLayout w:type="fixed"/>
+        <w:tblLook w:firstRow="0" w:lastRow="0" w:firstColumn="0" w:lastColumn="0" w:noHBand="0" w:noVBand="0" w:val="0000"/>
+      </w:tblPr>
+      <w:tblGrid>
+        <w:gridCol w:w="7920"/>
+      </w:tblGrid>
+      <w:tr>
+        <w:tc>
+          <w:tcPr/>
+          <w:bookmarkStart w:id="104" w:name="supptbl-psis-ess"/>
           <w:p>
             <w:pPr>
               <w:jc w:val="center"/>
@@ -19554,7 +19356,211 @@
               <w:t xml:space="preserve">Table S6: Aggregate importance-sampling effective sample size by fit-quality arm.</w:t>
             </w:r>
           </w:p>
+          <w:tbl>
+            <w:tblPr>
+              <w:tblStyle w:val="Table"/>
+              <w:tblW w:type="auto" w:w="0"/>
+              <w:tblLook w:firstRow="1" w:lastRow="0" w:firstColumn="0" w:lastColumn="0" w:noHBand="0" w:noVBand="0" w:val="0020"/>
+            </w:tblPr>
+            <w:tblGrid>
+              <w:gridCol w:w="1584"/>
+              <w:gridCol w:w="1584"/>
+              <w:gridCol w:w="1584"/>
+              <w:gridCol w:w="1584"/>
+              <w:gridCol w:w="1584"/>
+            </w:tblGrid>
+            <w:tr>
+              <w:trPr>
+                <w:tblHeader w:val="on"/>
+              </w:trPr>
+              <w:tc>
+                <w:tcPr/>
+                <w:p>
+                  <w:pPr>
+                    <w:pStyle w:val="Compact"/>
+                    <w:jc w:val="center"/>
+                  </w:pPr>
+                  <w:r>
+                    <w:t xml:space="preserve">Fit-quality arm</w:t>
+                  </w:r>
+                </w:p>
+              </w:tc>
+              <w:tc>
+                <w:tcPr/>
+                <w:p>
+                  <w:pPr>
+                    <w:pStyle w:val="Compact"/>
+                    <w:jc w:val="center"/>
+                  </w:pPr>
+                  <w:r>
+                    <w:t xml:space="preserve">Mean</w:t>
+                  </w:r>
+                </w:p>
+              </w:tc>
+              <w:tc>
+                <w:tcPr/>
+                <w:p>
+                  <w:pPr>
+                    <w:pStyle w:val="Compact"/>
+                    <w:jc w:val="center"/>
+                  </w:pPr>
+                  <w:r>
+                    <w:t xml:space="preserve">Median</w:t>
+                  </w:r>
+                </w:p>
+              </w:tc>
+              <w:tc>
+                <w:tcPr/>
+                <w:p>
+                  <w:pPr>
+                    <w:pStyle w:val="Compact"/>
+                    <w:jc w:val="center"/>
+                  </w:pPr>
+                  <w:r>
+                    <w:t xml:space="preserve">Minimum</w:t>
+                  </w:r>
+                </w:p>
+              </w:tc>
+              <w:tc>
+                <w:tcPr/>
+                <w:p>
+                  <w:pPr>
+                    <w:pStyle w:val="Compact"/>
+                    <w:jc w:val="center"/>
+                  </w:pPr>
+                  <w:r>
+                    <w:t xml:space="preserve">Maximum</w:t>
+                  </w:r>
+                </w:p>
+              </w:tc>
+            </w:tr>
+            <w:tr>
+              <w:tc>
+                <w:tcPr/>
+                <w:p>
+                  <w:pPr>
+                    <w:pStyle w:val="Compact"/>
+                    <w:jc w:val="center"/>
+                  </w:pPr>
+                  <w:r>
+                    <w:t xml:space="preserve">bad</w:t>
+                  </w:r>
+                </w:p>
+              </w:tc>
+              <w:tc>
+                <w:tcPr/>
+                <w:p>
+                  <w:pPr>
+                    <w:pStyle w:val="Compact"/>
+                    <w:jc w:val="center"/>
+                  </w:pPr>
+                  <w:r>
+                    <w:t xml:space="preserve">1200</w:t>
+                  </w:r>
+                </w:p>
+              </w:tc>
+              <w:tc>
+                <w:tcPr/>
+                <w:p>
+                  <w:pPr>
+                    <w:pStyle w:val="Compact"/>
+                    <w:jc w:val="center"/>
+                  </w:pPr>
+                  <w:r>
+                    <w:t xml:space="preserve">1180</w:t>
+                  </w:r>
+                </w:p>
+              </w:tc>
+              <w:tc>
+                <w:tcPr/>
+                <w:p>
+                  <w:pPr>
+                    <w:pStyle w:val="Compact"/>
+                    <w:jc w:val="center"/>
+                  </w:pPr>
+                  <w:r>
+                    <w:t xml:space="preserve">175</w:t>
+                  </w:r>
+                </w:p>
+              </w:tc>
+              <w:tc>
+                <w:tcPr/>
+                <w:p>
+                  <w:pPr>
+                    <w:pStyle w:val="Compact"/>
+                    <w:jc w:val="center"/>
+                  </w:pPr>
+                  <w:r>
+                    <w:t xml:space="preserve">2850</w:t>
+                  </w:r>
+                </w:p>
+              </w:tc>
+            </w:tr>
+            <w:tr>
+              <w:tc>
+                <w:tcPr/>
+                <w:p>
+                  <w:pPr>
+                    <w:pStyle w:val="Compact"/>
+                    <w:jc w:val="center"/>
+                  </w:pPr>
+                  <w:r>
+                    <w:t xml:space="preserve">good</w:t>
+                  </w:r>
+                </w:p>
+              </w:tc>
+              <w:tc>
+                <w:tcPr/>
+                <w:p>
+                  <w:pPr>
+                    <w:pStyle w:val="Compact"/>
+                    <w:jc w:val="center"/>
+                  </w:pPr>
+                  <w:r>
+                    <w:t xml:space="preserve">1790</w:t>
+                  </w:r>
+                </w:p>
+              </w:tc>
+              <w:tc>
+                <w:tcPr/>
+                <w:p>
+                  <w:pPr>
+                    <w:pStyle w:val="Compact"/>
+                    <w:jc w:val="center"/>
+                  </w:pPr>
+                  <w:r>
+                    <w:t xml:space="preserve">1790</w:t>
+                  </w:r>
+                </w:p>
+              </w:tc>
+              <w:tc>
+                <w:tcPr/>
+                <w:p>
+                  <w:pPr>
+                    <w:pStyle w:val="Compact"/>
+                    <w:jc w:val="center"/>
+                  </w:pPr>
+                  <w:r>
+                    <w:t xml:space="preserve">10.7</w:t>
+                  </w:r>
+                </w:p>
+              </w:tc>
+              <w:tc>
+                <w:tcPr/>
+                <w:p>
+                  <w:pPr>
+                    <w:pStyle w:val="Compact"/>
+                    <w:jc w:val="center"/>
+                  </w:pPr>
+                  <w:r>
+                    <w:t xml:space="preserve">3220</w:t>
+                  </w:r>
+                </w:p>
+              </w:tc>
+            </w:tr>
+          </w:tbl>
           <w:bookmarkEnd w:id="104"/>
+          <w:p/>
         </w:tc>
       </w:tr>
     </w:tbl>
@@ -19580,209 +19586,6 @@
         <w:tc>
           <w:tcPr/>
           <w:bookmarkStart w:id="105" w:name="supptbl-deltaofv-calibration"/>
-          <w:tbl>
-            <w:tblPr>
-              <w:tblStyle w:val="Table"/>
-              <w:tblW w:type="pct" w:w="5000"/>
-              <w:tblLayout w:type="fixed"/>
-              <w:tblLook w:firstRow="1" w:lastRow="0" w:firstColumn="0" w:lastColumn="0" w:noHBand="0" w:noVBand="0" w:val="0020"/>
-            </w:tblPr>
-            <w:tblGrid>
-              <w:gridCol w:w="1131"/>
-              <w:gridCol w:w="1131"/>
-              <w:gridCol w:w="1131"/>
-              <w:gridCol w:w="1131"/>
-              <w:gridCol w:w="1131"/>
-              <w:gridCol w:w="1131"/>
-              <w:gridCol w:w="1131"/>
-            </w:tblGrid>
-            <w:tr>
-              <w:trPr>
-                <w:tblHeader w:val="on"/>
-              </w:trPr>
-              <w:tc>
-                <w:tcPr/>
-                <w:p>
-                  <w:pPr>
-                    <w:pStyle w:val="Compact"/>
-                    <w:jc w:val="center"/>
-                  </w:pPr>
-                  <w:r>
-                    <w:t xml:space="preserve">Condition</w:t>
-                  </w:r>
-                </w:p>
-              </w:tc>
-              <w:tc>
-                <w:tcPr/>
-                <w:p>
-                  <w:pPr>
-                    <w:pStyle w:val="Compact"/>
-                    <w:jc w:val="center"/>
-                  </w:pPr>
-                  <w:r>
-                    <w:t xml:space="preserve">Replicates</w:t>
-                  </w:r>
-                </w:p>
-              </w:tc>
-              <w:tc>
-                <w:tcPr/>
-                <w:p>
-                  <w:pPr>
-                    <w:pStyle w:val="Compact"/>
-                    <w:jc w:val="center"/>
-                  </w:pPr>
-                  <w:r>
-                    <w:t xml:space="preserve">Boundary fraction (%)</w:t>
-                  </w:r>
-                </w:p>
-              </w:tc>
-              <w:tc>
-                <w:tcPr/>
-                <w:p>
-                  <w:pPr>
-                    <w:pStyle w:val="Compact"/>
-                    <w:jc w:val="center"/>
-                  </w:pPr>
-                  <w:r>
-                    <w:t xml:space="preserve">Negative</w:t>
-                  </w:r>
-                  <w:r>
-                    <w:t xml:space="preserve"> </w:t>
-                  </w:r>
-                  <m:oMath>
-                    <m:r>
-                      <m:t>Δ</m:t>
-                    </m:r>
-                  </m:oMath>
-                  <w:r>
-                    <w:t xml:space="preserve">OFV</w:t>
-                  </w:r>
-                </w:p>
-              </w:tc>
-              <w:tc>
-                <w:tcPr/>
-                <w:p>
-                  <w:pPr>
-                    <w:pStyle w:val="Compact"/>
-                    <w:jc w:val="center"/>
-                  </w:pPr>
-                  <w:r>
-                    <w:t xml:space="preserve">KS statistic</w:t>
-                  </w:r>
-                </w:p>
-              </w:tc>
-              <w:tc>
-                <w:tcPr/>
-                <w:p>
-                  <w:pPr>
-                    <w:pStyle w:val="Compact"/>
-                    <w:jc w:val="center"/>
-                  </w:pPr>
-                  <w:r>
-                    <w:t xml:space="preserve">KS p-value</w:t>
-                  </w:r>
-                </w:p>
-              </w:tc>
-              <w:tc>
-                <w:tcPr/>
-                <w:p>
-                  <w:pPr>
-                    <w:pStyle w:val="Compact"/>
-                    <w:jc w:val="center"/>
-                  </w:pPr>
-                  <w:r>
-                    <w:t xml:space="preserve">Type-I error (%)</w:t>
-                  </w:r>
-                </w:p>
-              </w:tc>
-            </w:tr>
-            <w:tr>
-              <w:tc>
-                <w:tcPr/>
-                <w:p>
-                  <w:pPr>
-                    <w:pStyle w:val="Compact"/>
-                    <w:jc w:val="center"/>
-                  </w:pPr>
-                  <w:r>
-                    <w:t xml:space="preserve">free</w:t>
-                  </w:r>
-                </w:p>
-              </w:tc>
-              <w:tc>
-                <w:tcPr/>
-                <w:p>
-                  <w:pPr>
-                    <w:pStyle w:val="Compact"/>
-                    <w:jc w:val="center"/>
-                  </w:pPr>
-                  <w:r>
-                    <w:t xml:space="preserve">100</w:t>
-                  </w:r>
-                </w:p>
-              </w:tc>
-              <w:tc>
-                <w:tcPr/>
-                <w:p>
-                  <w:pPr>
-                    <w:pStyle w:val="Compact"/>
-                    <w:jc w:val="center"/>
-                  </w:pPr>
-                  <w:r>
-                    <w:t xml:space="preserve">25</w:t>
-                  </w:r>
-                </w:p>
-              </w:tc>
-              <w:tc>
-                <w:tcPr/>
-                <w:p>
-                  <w:pPr>
-                    <w:pStyle w:val="Compact"/>
-                    <w:jc w:val="center"/>
-                  </w:pPr>
-                  <w:r>
-                    <w:t xml:space="preserve">22</w:t>
-                  </w:r>
-                </w:p>
-              </w:tc>
-              <w:tc>
-                <w:tcPr/>
-                <w:p>
-                  <w:pPr>
-                    <w:pStyle w:val="Compact"/>
-                    <w:jc w:val="center"/>
-                  </w:pPr>
-                  <w:r>
-                    <w:t xml:space="preserve">0.2922</w:t>
-                  </w:r>
-                </w:p>
-              </w:tc>
-              <w:tc>
-                <w:tcPr/>
-                <w:p>
-                  <w:pPr>
-                    <w:pStyle w:val="Compact"/>
-                    <w:jc w:val="center"/>
-                  </w:pPr>
-                  <w:r>
-                    <w:t xml:space="preserve">&lt;0.0001</w:t>
-                  </w:r>
-                </w:p>
-              </w:tc>
-              <w:tc>
-                <w:tcPr/>
-                <w:p>
-                  <w:pPr>
-                    <w:pStyle w:val="Compact"/>
-                    <w:jc w:val="center"/>
-                  </w:pPr>
-                  <w:r>
-                    <w:t xml:space="preserve">6</w:t>
-                  </w:r>
-                </w:p>
-              </w:tc>
-            </w:tr>
-          </w:tbl>
           <w:p>
             <w:pPr>
               <w:jc w:val="center"/>
@@ -19888,7 +19691,211 @@
               <w:t xml:space="preserve">for the strictly positive replicates, and empirical type-I error using the correct Self-Liang boundary-mixture cutoff.</w:t>
             </w:r>
           </w:p>
+          <w:tbl>
+            <w:tblPr>
+              <w:tblStyle w:val="Table"/>
+              <w:tblW w:type="pct" w:w="5000"/>
+              <w:tblLayout w:type="fixed"/>
+              <w:tblLook w:firstRow="1" w:lastRow="0" w:firstColumn="0" w:lastColumn="0" w:noHBand="0" w:noVBand="0" w:val="0020"/>
+            </w:tblPr>
+            <w:tblGrid>
+              <w:gridCol w:w="1131"/>
+              <w:gridCol w:w="1131"/>
+              <w:gridCol w:w="1131"/>
+              <w:gridCol w:w="1131"/>
+              <w:gridCol w:w="1131"/>
+              <w:gridCol w:w="1131"/>
+              <w:gridCol w:w="1131"/>
+            </w:tblGrid>
+            <w:tr>
+              <w:trPr>
+                <w:tblHeader w:val="on"/>
+              </w:trPr>
+              <w:tc>
+                <w:tcPr/>
+                <w:p>
+                  <w:pPr>
+                    <w:pStyle w:val="Compact"/>
+                    <w:jc w:val="center"/>
+                  </w:pPr>
+                  <w:r>
+                    <w:t xml:space="preserve">Condition</w:t>
+                  </w:r>
+                </w:p>
+              </w:tc>
+              <w:tc>
+                <w:tcPr/>
+                <w:p>
+                  <w:pPr>
+                    <w:pStyle w:val="Compact"/>
+                    <w:jc w:val="center"/>
+                  </w:pPr>
+                  <w:r>
+                    <w:t xml:space="preserve">Replicates</w:t>
+                  </w:r>
+                </w:p>
+              </w:tc>
+              <w:tc>
+                <w:tcPr/>
+                <w:p>
+                  <w:pPr>
+                    <w:pStyle w:val="Compact"/>
+                    <w:jc w:val="center"/>
+                  </w:pPr>
+                  <w:r>
+                    <w:t xml:space="preserve">Boundary fraction (%)</w:t>
+                  </w:r>
+                </w:p>
+              </w:tc>
+              <w:tc>
+                <w:tcPr/>
+                <w:p>
+                  <w:pPr>
+                    <w:pStyle w:val="Compact"/>
+                    <w:jc w:val="center"/>
+                  </w:pPr>
+                  <w:r>
+                    <w:t xml:space="preserve">Negative</w:t>
+                  </w:r>
+                  <w:r>
+                    <w:t xml:space="preserve"> </w:t>
+                  </w:r>
+                  <m:oMath>
+                    <m:r>
+                      <m:t>Δ</m:t>
+                    </m:r>
+                  </m:oMath>
+                  <w:r>
+                    <w:t xml:space="preserve">OFV</w:t>
+                  </w:r>
+                </w:p>
+              </w:tc>
+              <w:tc>
+                <w:tcPr/>
+                <w:p>
+                  <w:pPr>
+                    <w:pStyle w:val="Compact"/>
+                    <w:jc w:val="center"/>
+                  </w:pPr>
+                  <w:r>
+                    <w:t xml:space="preserve">KS statistic</w:t>
+                  </w:r>
+                </w:p>
+              </w:tc>
+              <w:tc>
+                <w:tcPr/>
+                <w:p>
+                  <w:pPr>
+                    <w:pStyle w:val="Compact"/>
+                    <w:jc w:val="center"/>
+                  </w:pPr>
+                  <w:r>
+                    <w:t xml:space="preserve">KS p-value</w:t>
+                  </w:r>
+                </w:p>
+              </w:tc>
+              <w:tc>
+                <w:tcPr/>
+                <w:p>
+                  <w:pPr>
+                    <w:pStyle w:val="Compact"/>
+                    <w:jc w:val="center"/>
+                  </w:pPr>
+                  <w:r>
+                    <w:t xml:space="preserve">Type-I error (%)</w:t>
+                  </w:r>
+                </w:p>
+              </w:tc>
+            </w:tr>
+            <w:tr>
+              <w:tc>
+                <w:tcPr/>
+                <w:p>
+                  <w:pPr>
+                    <w:pStyle w:val="Compact"/>
+                    <w:jc w:val="center"/>
+                  </w:pPr>
+                  <w:r>
+                    <w:t xml:space="preserve">free</w:t>
+                  </w:r>
+                </w:p>
+              </w:tc>
+              <w:tc>
+                <w:tcPr/>
+                <w:p>
+                  <w:pPr>
+                    <w:pStyle w:val="Compact"/>
+                    <w:jc w:val="center"/>
+                  </w:pPr>
+                  <w:r>
+                    <w:t xml:space="preserve">100</w:t>
+                  </w:r>
+                </w:p>
+              </w:tc>
+              <w:tc>
+                <w:tcPr/>
+                <w:p>
+                  <w:pPr>
+                    <w:pStyle w:val="Compact"/>
+                    <w:jc w:val="center"/>
+                  </w:pPr>
+                  <w:r>
+                    <w:t xml:space="preserve">25</w:t>
+                  </w:r>
+                </w:p>
+              </w:tc>
+              <w:tc>
+                <w:tcPr/>
+                <w:p>
+                  <w:pPr>
+                    <w:pStyle w:val="Compact"/>
+                    <w:jc w:val="center"/>
+                  </w:pPr>
+                  <w:r>
+                    <w:t xml:space="preserve">22</w:t>
+                  </w:r>
+                </w:p>
+              </w:tc>
+              <w:tc>
+                <w:tcPr/>
+                <w:p>
+                  <w:pPr>
+                    <w:pStyle w:val="Compact"/>
+                    <w:jc w:val="center"/>
+                  </w:pPr>
+                  <w:r>
+                    <w:t xml:space="preserve">0.2922</w:t>
+                  </w:r>
+                </w:p>
+              </w:tc>
+              <w:tc>
+                <w:tcPr/>
+                <w:p>
+                  <w:pPr>
+                    <w:pStyle w:val="Compact"/>
+                    <w:jc w:val="center"/>
+                  </w:pPr>
+                  <w:r>
+                    <w:t xml:space="preserve">&lt;0.0001</w:t>
+                  </w:r>
+                </w:p>
+              </w:tc>
+              <w:tc>
+                <w:tcPr/>
+                <w:p>
+                  <w:pPr>
+                    <w:pStyle w:val="Compact"/>
+                    <w:jc w:val="center"/>
+                  </w:pPr>
+                  <w:r>
+                    <w:t xml:space="preserve">6</w:t>
+                  </w:r>
+                </w:p>
+              </w:tc>
+            </w:tr>
+          </w:tbl>
           <w:bookmarkEnd w:id="105"/>
+          <w:p/>
         </w:tc>
       </w:tr>
     </w:tbl>

</xml_diff>